<commit_message>
feat: perbaikan sistem persuratan SKKM, data kependudukan fail-safe, dan impor eksternal multi-role real-time
</commit_message>
<xml_diff>
--- a/public/templates/SKKM.docx
+++ b/public/templates/SKKM.docx
@@ -1,5 +1,2811 @@
 
-<file path=word/document.xml>...
+<file path=word/document.xml><?xml version="1.0" encoding="utf-8"?>
+<w:document xmlns:wpc="http://schemas.microsoft.com/office/word/2010/wordprocessingCanvas" xmlns:mc="http://schemas.openxmlformats.org/markup-compatibility/2006" xmlns:o="urn:schemas-microsoft-com:office:office" xmlns:r="http://schemas.openxmlformats.org/officeDocument/2006/relationships" xmlns:m="http://schemas.openxmlformats.org/officeDocument/2006/math" xmlns:v="urn:schemas-microsoft-com:vml" xmlns:wp="http://schemas.openxmlformats.org/drawingml/2006/wordprocessingDrawing" xmlns:w="http://schemas.openxmlformats.org/wordprocessingml/2006/main" xmlns:wpg="http://schemas.microsoft.com/office/word/2010/wordprocessingGroup" xmlns:wpi="http://schemas.microsoft.com/office/word/2010/wordprocessingInk" xmlns:a="http://schemas.openxmlformats.org/drawingml/2006/main" xmlns:wne="http://schemas.microsoft.com/office/word/2006/wordml" xmlns:wps="http://schemas.microsoft.com/office/word/2010/wordprocessingShape" xmlns:w10="urn:schemas-microsoft-com:office:word" xmlns:wp14="http://schemas.microsoft.com/office/word/2010/wordprocessingDrawing" xmlns:w14="http://schemas.microsoft.com/office/word/2010/wordml" xmlns:w15="http://schemas.microsoft.com/office/word/2012/wordml" xmlns:w16cex="http://schemas.microsoft.com/office/word/2018/wordml/cex" xmlns:w16cid="http://schemas.microsoft.com/office/word/2016/wordml/cid" xmlns:w16="http://schemas.microsoft.com/office/word/2018/wordml" xmlns:w16sdtdh="http://schemas.microsoft.com/office/word/2020/wordml/sdtdatahash" xmlns:w16se="http://schemas.microsoft.com/office/word/2015/wordml/symex" mc:Ignorable="w14 w15 w16se w16cid w16 w16cex w16sdtdh wp14">
+  <w:body>
+    <w:p>
+      <w:pPr>
+        <w:pBdr/>
+        <w:tabs>
+          <w:tab w:val="left" w:leader="none" w:pos="3299"/>
+        </w:tabs>
+        <w:spacing w:after="0"/>
+        <w:ind/>
+        <w:rPr>
+          <w:rFonts w:ascii="Arial Narrow" w:hAnsi="Arial Narrow"/>
+          <w:b/>
+          <w:sz w:val="24"/>
+          <w:szCs w:val="24"/>
+        </w:rPr>
+      </w:pPr>
+      <w:r>
+        <w:rPr>
+          <w:rFonts w:ascii="Arial Narrow" w:hAnsi="Arial Narrow"/>
+          <w:b/>
+          <w:sz w:val="24"/>
+          <w:szCs w:val="24"/>
+        </w:rPr>
+        <w:tab/>
+      </w:r>
+      <w:r>
+        <w:rPr>
+          <w:rFonts w:ascii="Arial Narrow" w:hAnsi="Arial Narrow"/>
+          <w:b/>
+          <w:sz w:val="24"/>
+          <w:szCs w:val="24"/>
+        </w:rPr>
+      </w:r>
+    </w:p>
+    <w:p>
+      <w:pPr>
+        <w:pBdr/>
+        <w:tabs>
+          <w:tab w:val="left" w:leader="none" w:pos="3299"/>
+        </w:tabs>
+        <w:spacing w:after="0"/>
+        <w:ind/>
+        <w:rPr>
+          <w:rFonts w:ascii="Arial Narrow" w:hAnsi="Arial Narrow"/>
+          <w:b/>
+          <w:sz w:val="24"/>
+          <w:szCs w:val="24"/>
+        </w:rPr>
+      </w:pPr>
+      <w:r>
+        <w:rPr>
+          <w:rFonts w:ascii="Arial Narrow" w:hAnsi="Arial Narrow"/>
+          <w:b/>
+          <w:sz w:val="24"/>
+          <w:szCs w:val="24"/>
+        </w:rPr>
+      </w:r>
+      <w:r>
+        <w:rPr>
+          <w:rFonts w:ascii="Arial Narrow" w:hAnsi="Arial Narrow"/>
+          <w:b/>
+          <w:sz w:val="24"/>
+          <w:szCs w:val="24"/>
+        </w:rPr>
+      </w:r>
+    </w:p>
+    <w:p>
+      <w:pPr>
+        <w:pBdr/>
+        <w:spacing w:after="0"/>
+        <w:ind/>
+        <w:jc w:val="center"/>
+        <w:rPr>
+          <w:rFonts w:ascii="Arial Narrow" w:hAnsi="Arial Narrow"/>
+          <w:b/>
+          <w:sz w:val="28"/>
+          <w:szCs w:val="28"/>
+          <w:u w:val="single"/>
+        </w:rPr>
+      </w:pPr>
+      <w:r>
+        <w:rPr>
+          <w:rFonts w:ascii="Arial Narrow" w:hAnsi="Arial Narrow"/>
+          <w:b/>
+          <w:sz w:val="28"/>
+          <w:szCs w:val="28"/>
+          <w:u w:val="single"/>
+        </w:rPr>
+        <w:t xml:space="preserve">SURAT KETERANGAN </w:t>
+      </w:r>
+      <w:r>
+        <w:rPr>
+          <w:rFonts w:ascii="Arial Narrow" w:hAnsi="Arial Narrow"/>
+          <w:b/>
+          <w:sz w:val="28"/>
+          <w:szCs w:val="28"/>
+          <w:u w:val="single"/>
+        </w:rPr>
+        <w:t xml:space="preserve">KELUARGA MISKIN</w:t>
+      </w:r>
+      <w:r>
+        <w:rPr>
+          <w:rFonts w:ascii="Arial Narrow" w:hAnsi="Arial Narrow"/>
+          <w:b/>
+          <w:sz w:val="28"/>
+          <w:szCs w:val="28"/>
+          <w:u w:val="single"/>
+        </w:rPr>
+      </w:r>
+    </w:p>
+    <w:p>
+      <w:pPr>
+        <w:pBdr/>
+        <w:spacing w:after="0"/>
+        <w:ind/>
+        <w:jc w:val="center"/>
+        <w:rPr>
+          <w:rFonts w:ascii="Arial Narrow" w:hAnsi="Arial Narrow"/>
+          <w:sz w:val="24"/>
+          <w:szCs w:val="24"/>
+        </w:rPr>
+      </w:pPr>
+      <w:r>
+        <w:rPr>
+          <w:rFonts w:ascii="Arial Narrow" w:hAnsi="Arial Narrow"/>
+          <w:sz w:val="24"/>
+          <w:szCs w:val="24"/>
+        </w:rPr>
+        <w:t xml:space="preserve">Nomor</w:t>
+      </w:r>
+      <w:r>
+        <w:rPr>
+          <w:rFonts w:ascii="Arial Narrow" w:hAnsi="Arial Narrow"/>
+          <w:sz w:val="24"/>
+          <w:szCs w:val="24"/>
+        </w:rPr>
+        <w:t xml:space="preserve">  :</w:t>
+      </w:r>
+      <w:r>
+        <w:rPr>
+          <w:rFonts w:ascii="Arial Narrow" w:hAnsi="Arial Narrow"/>
+          <w:sz w:val="24"/>
+          <w:szCs w:val="24"/>
+        </w:rPr>
+        <w:t xml:space="preserve"> 4</w:t>
+      </w:r>
+      <w:r>
+        <w:rPr>
+          <w:rFonts w:ascii="Arial Narrow" w:hAnsi="Arial Narrow"/>
+          <w:sz w:val="24"/>
+          <w:szCs w:val="24"/>
+        </w:rPr>
+        <w:t xml:space="preserve">00.3.8.8</w:t>
+      </w:r>
+      <w:r>
+        <w:rPr>
+          <w:rFonts w:ascii="Arial Narrow" w:hAnsi="Arial Narrow"/>
+          <w:sz w:val="24"/>
+          <w:szCs w:val="24"/>
+        </w:rPr>
+        <w:t xml:space="preserve">/            - </w:t>
+      </w:r>
+      <w:r>
+        <w:rPr>
+          <w:rFonts w:ascii="Arial Narrow" w:hAnsi="Arial Narrow"/>
+          <w:sz w:val="24"/>
+          <w:szCs w:val="24"/>
+        </w:rPr>
+        <w:t xml:space="preserve">Kesra</w:t>
+      </w:r>
+      <w:r>
+        <w:rPr>
+          <w:rFonts w:ascii="Arial Narrow" w:hAnsi="Arial Narrow"/>
+          <w:sz w:val="24"/>
+          <w:szCs w:val="24"/>
+        </w:rPr>
+      </w:r>
+    </w:p>
+    <w:p>
+      <w:pPr>
+        <w:pBdr/>
+        <w:spacing w:after="0"/>
+        <w:ind/>
+        <w:jc w:val="center"/>
+        <w:rPr>
+          <w:rFonts w:ascii="Arial Narrow" w:hAnsi="Arial Narrow"/>
+          <w:sz w:val="12"/>
+          <w:szCs w:val="24"/>
+        </w:rPr>
+      </w:pPr>
+      <w:r>
+        <w:rPr>
+          <w:rFonts w:ascii="Arial Narrow" w:hAnsi="Arial Narrow"/>
+          <w:sz w:val="12"/>
+          <w:szCs w:val="24"/>
+        </w:rPr>
+      </w:r>
+      <w:r>
+        <w:rPr>
+          <w:rFonts w:ascii="Arial Narrow" w:hAnsi="Arial Narrow"/>
+          <w:sz w:val="12"/>
+          <w:szCs w:val="24"/>
+        </w:rPr>
+      </w:r>
+    </w:p>
+    <w:p>
+      <w:pPr>
+        <w:pBdr/>
+        <w:spacing w:after="0"/>
+        <w:ind w:firstLine="720"/>
+        <w:jc w:val="both"/>
+        <w:rPr>
+          <w:rFonts w:ascii="Arial Narrow" w:hAnsi="Arial Narrow"/>
+          <w:sz w:val="24"/>
+          <w:szCs w:val="24"/>
+        </w:rPr>
+      </w:pPr>
+      <w:r>
+        <w:rPr>
+          <w:rFonts w:ascii="Arial Narrow" w:hAnsi="Arial Narrow"/>
+          <w:sz w:val="24"/>
+          <w:szCs w:val="24"/>
+        </w:rPr>
+        <w:t xml:space="preserve">Yang </w:t>
+      </w:r>
+      <w:r>
+        <w:rPr>
+          <w:rFonts w:ascii="Arial Narrow" w:hAnsi="Arial Narrow"/>
+          <w:sz w:val="24"/>
+          <w:szCs w:val="24"/>
+        </w:rPr>
+        <w:t xml:space="preserve">bertanda</w:t>
+      </w:r>
+      <w:r>
+        <w:rPr>
+          <w:rFonts w:ascii="Arial Narrow" w:hAnsi="Arial Narrow"/>
+          <w:sz w:val="24"/>
+          <w:szCs w:val="24"/>
+        </w:rPr>
+        <w:t xml:space="preserve"> </w:t>
+      </w:r>
+      <w:r>
+        <w:rPr>
+          <w:rFonts w:ascii="Arial Narrow" w:hAnsi="Arial Narrow"/>
+          <w:sz w:val="24"/>
+          <w:szCs w:val="24"/>
+        </w:rPr>
+        <w:t xml:space="preserve">tangan</w:t>
+      </w:r>
+      <w:r>
+        <w:rPr>
+          <w:rFonts w:ascii="Arial Narrow" w:hAnsi="Arial Narrow"/>
+          <w:sz w:val="24"/>
+          <w:szCs w:val="24"/>
+        </w:rPr>
+        <w:t xml:space="preserve"> </w:t>
+      </w:r>
+      <w:r>
+        <w:rPr>
+          <w:rFonts w:ascii="Arial Narrow" w:hAnsi="Arial Narrow"/>
+          <w:sz w:val="24"/>
+          <w:szCs w:val="24"/>
+        </w:rPr>
+        <w:t xml:space="preserve">dibawah</w:t>
+      </w:r>
+      <w:r>
+        <w:rPr>
+          <w:rFonts w:ascii="Arial Narrow" w:hAnsi="Arial Narrow"/>
+          <w:sz w:val="24"/>
+          <w:szCs w:val="24"/>
+        </w:rPr>
+        <w:t xml:space="preserve"> </w:t>
+      </w:r>
+      <w:r>
+        <w:rPr>
+          <w:rFonts w:ascii="Arial Narrow" w:hAnsi="Arial Narrow"/>
+          <w:sz w:val="24"/>
+          <w:szCs w:val="24"/>
+        </w:rPr>
+        <w:t xml:space="preserve">ini</w:t>
+      </w:r>
+      <w:r>
+        <w:rPr>
+          <w:rFonts w:ascii="Arial Narrow" w:hAnsi="Arial Narrow"/>
+          <w:sz w:val="24"/>
+          <w:szCs w:val="24"/>
+        </w:rPr>
+        <w:t xml:space="preserve"> </w:t>
+      </w:r>
+      <w:r>
+        <w:rPr>
+          <w:rFonts w:ascii="Arial Narrow" w:hAnsi="Arial Narrow"/>
+          <w:sz w:val="24"/>
+          <w:szCs w:val="24"/>
+        </w:rPr>
+        <w:t xml:space="preserve">Kepala</w:t>
+      </w:r>
+      <w:r>
+        <w:rPr>
+          <w:rFonts w:ascii="Arial Narrow" w:hAnsi="Arial Narrow"/>
+          <w:sz w:val="24"/>
+          <w:szCs w:val="24"/>
+        </w:rPr>
+        <w:t xml:space="preserve"> </w:t>
+      </w:r>
+      <w:r>
+        <w:rPr>
+          <w:rFonts w:ascii="Arial Narrow" w:hAnsi="Arial Narrow"/>
+          <w:sz w:val="24"/>
+          <w:szCs w:val="24"/>
+        </w:rPr>
+        <w:t xml:space="preserve">Desa</w:t>
+      </w:r>
+      <w:r>
+        <w:rPr>
+          <w:rFonts w:ascii="Arial Narrow" w:hAnsi="Arial Narrow"/>
+          <w:sz w:val="24"/>
+          <w:szCs w:val="24"/>
+        </w:rPr>
+        <w:t xml:space="preserve"> </w:t>
+      </w:r>
+      <w:r>
+        <w:rPr>
+          <w:rFonts w:ascii="Arial Narrow" w:hAnsi="Arial Narrow"/>
+          <w:sz w:val="24"/>
+          <w:szCs w:val="24"/>
+        </w:rPr>
+        <w:t xml:space="preserve">Cimanggu</w:t>
+      </w:r>
+      <w:r>
+        <w:rPr>
+          <w:rFonts w:ascii="Arial Narrow" w:hAnsi="Arial Narrow"/>
+          <w:sz w:val="24"/>
+          <w:szCs w:val="24"/>
+        </w:rPr>
+        <w:t xml:space="preserve"> I </w:t>
+      </w:r>
+      <w:r>
+        <w:rPr>
+          <w:rFonts w:ascii="Arial Narrow" w:hAnsi="Arial Narrow"/>
+          <w:sz w:val="24"/>
+          <w:szCs w:val="24"/>
+        </w:rPr>
+        <w:t xml:space="preserve">Kecamatan</w:t>
+      </w:r>
+      <w:r>
+        <w:rPr>
+          <w:rFonts w:ascii="Arial Narrow" w:hAnsi="Arial Narrow"/>
+          <w:sz w:val="24"/>
+          <w:szCs w:val="24"/>
+        </w:rPr>
+        <w:t xml:space="preserve"> </w:t>
+      </w:r>
+      <w:r>
+        <w:rPr>
+          <w:rFonts w:ascii="Arial Narrow" w:hAnsi="Arial Narrow"/>
+          <w:sz w:val="24"/>
+          <w:szCs w:val="24"/>
+        </w:rPr>
+        <w:t xml:space="preserve">Cibungbulang</w:t>
+      </w:r>
+      <w:r>
+        <w:rPr>
+          <w:rFonts w:ascii="Arial Narrow" w:hAnsi="Arial Narrow"/>
+          <w:sz w:val="24"/>
+          <w:szCs w:val="24"/>
+        </w:rPr>
+        <w:t xml:space="preserve"> </w:t>
+      </w:r>
+      <w:r>
+        <w:rPr>
+          <w:rFonts w:ascii="Arial Narrow" w:hAnsi="Arial Narrow"/>
+          <w:sz w:val="24"/>
+          <w:szCs w:val="24"/>
+        </w:rPr>
+        <w:t xml:space="preserve">Kabupaten</w:t>
+      </w:r>
+      <w:r>
+        <w:rPr>
+          <w:rFonts w:ascii="Arial Narrow" w:hAnsi="Arial Narrow"/>
+          <w:sz w:val="24"/>
+          <w:szCs w:val="24"/>
+        </w:rPr>
+        <w:t xml:space="preserve"> Bogor, </w:t>
+      </w:r>
+      <w:r>
+        <w:rPr>
+          <w:rFonts w:ascii="Arial Narrow" w:hAnsi="Arial Narrow"/>
+          <w:sz w:val="24"/>
+          <w:szCs w:val="24"/>
+        </w:rPr>
+        <w:t xml:space="preserve">menerangkan</w:t>
+      </w:r>
+      <w:r>
+        <w:rPr>
+          <w:rFonts w:ascii="Arial Narrow" w:hAnsi="Arial Narrow"/>
+          <w:sz w:val="24"/>
+          <w:szCs w:val="24"/>
+        </w:rPr>
+        <w:t xml:space="preserve"> </w:t>
+      </w:r>
+      <w:r>
+        <w:rPr>
+          <w:rFonts w:ascii="Arial Narrow" w:hAnsi="Arial Narrow"/>
+          <w:sz w:val="24"/>
+          <w:szCs w:val="24"/>
+        </w:rPr>
+        <w:t xml:space="preserve">bahwa</w:t>
+      </w:r>
+      <w:r>
+        <w:rPr>
+          <w:rFonts w:ascii="Arial Narrow" w:hAnsi="Arial Narrow"/>
+          <w:sz w:val="24"/>
+          <w:szCs w:val="24"/>
+        </w:rPr>
+        <w:tab/>
+        <w:t xml:space="preserve">:</w:t>
+      </w:r>
+      <w:r>
+        <w:rPr>
+          <w:rFonts w:ascii="Arial Narrow" w:hAnsi="Arial Narrow"/>
+          <w:sz w:val="24"/>
+          <w:szCs w:val="24"/>
+        </w:rPr>
+      </w:r>
+    </w:p>
+    <w:p>
+      <w:pPr>
+        <w:pBdr/>
+        <w:spacing w:after="0"/>
+        <w:ind w:firstLine="720"/>
+        <w:jc w:val="both"/>
+        <w:rPr>
+          <w:rFonts w:ascii="Arial Narrow" w:hAnsi="Arial Narrow"/>
+          <w:sz w:val="24"/>
+          <w:szCs w:val="24"/>
+        </w:rPr>
+      </w:pPr>
+      <w:r>
+        <w:rPr>
+          <w:rFonts w:ascii="Arial Narrow" w:hAnsi="Arial Narrow"/>
+          <w:sz w:val="24"/>
+          <w:szCs w:val="24"/>
+        </w:rPr>
+      </w:r>
+      <w:r>
+        <w:rPr>
+          <w:rFonts w:ascii="Arial Narrow" w:hAnsi="Arial Narrow"/>
+          <w:sz w:val="24"/>
+          <w:szCs w:val="24"/>
+        </w:rPr>
+      </w:r>
+    </w:p>
+    <w:p>
+      <w:pPr>
+        <w:pBdr/>
+        <w:spacing w:after="0"/>
+        <w:ind w:firstLine="720"/>
+        <w:jc w:val="both"/>
+        <w:rPr>
+          <w:rFonts w:ascii="Arial Narrow" w:hAnsi="Arial Narrow"/>
+          <w:sz w:val="24"/>
+          <w:szCs w:val="24"/>
+        </w:rPr>
+      </w:pPr>
+      <w:r>
+        <w:rPr>
+          <w:rFonts w:ascii="Arial Narrow" w:hAnsi="Arial Narrow"/>
+          <w:sz w:val="24"/>
+          <w:szCs w:val="24"/>
+        </w:rPr>
+        <w:t xml:space="preserve">Nama</w:t>
+      </w:r>
+      <w:r>
+        <w:rPr>
+          <w:rFonts w:ascii="Arial Narrow" w:hAnsi="Arial Narrow"/>
+          <w:sz w:val="24"/>
+          <w:szCs w:val="24"/>
+        </w:rPr>
+        <w:t xml:space="preserve"> </w:t>
+      </w:r>
+      <w:r>
+        <w:rPr>
+          <w:rFonts w:ascii="Arial Narrow" w:hAnsi="Arial Narrow"/>
+          <w:sz w:val="24"/>
+          <w:szCs w:val="24"/>
+        </w:rPr>
+        <w:t xml:space="preserve">Lengkap</w:t>
+      </w:r>
+      <w:r>
+        <w:rPr>
+          <w:rFonts w:ascii="Arial Narrow" w:hAnsi="Arial Narrow"/>
+          <w:sz w:val="24"/>
+          <w:szCs w:val="24"/>
+        </w:rPr>
+        <w:tab/>
+      </w:r>
+      <w:r>
+        <w:rPr>
+          <w:rFonts w:ascii="Arial Narrow" w:hAnsi="Arial Narrow"/>
+          <w:sz w:val="24"/>
+          <w:szCs w:val="24"/>
+        </w:rPr>
+        <w:tab/>
+      </w:r>
+      <w:r>
+        <w:rPr>
+          <w:rFonts w:ascii="Arial Narrow" w:hAnsi="Arial Narrow"/>
+          <w:sz w:val="24"/>
+          <w:szCs w:val="24"/>
+        </w:rPr>
+        <w:tab/>
+        <w:t xml:space="preserve">:  </w:t>
+      </w:r>
+      <w:r>
+        <w:rPr>
+          <w:rFonts w:ascii="Arial Narrow" w:hAnsi="Arial Narrow"/>
+          <w:sz w:val="24"/>
+          <w:szCs w:val="24"/>
+        </w:rPr>
+      </w:r>
+    </w:p>
+    <w:p>
+      <w:pPr>
+        <w:pBdr/>
+        <w:spacing w:after="0"/>
+        <w:ind w:firstLine="720"/>
+        <w:jc w:val="both"/>
+        <w:rPr>
+          <w:rFonts w:ascii="Arial Narrow" w:hAnsi="Arial Narrow" w:cs="Times New Roman"/>
+          <w:b/>
+          <w:sz w:val="24"/>
+          <w:szCs w:val="24"/>
+        </w:rPr>
+      </w:pPr>
+      <w:r>
+        <w:rPr>
+          <w:rFonts w:ascii="Arial Narrow" w:hAnsi="Arial Narrow"/>
+          <w:sz w:val="24"/>
+          <w:szCs w:val="24"/>
+        </w:rPr>
+        <w:t xml:space="preserve">Jenis</w:t>
+      </w:r>
+      <w:r>
+        <w:rPr>
+          <w:rFonts w:ascii="Arial Narrow" w:hAnsi="Arial Narrow"/>
+          <w:sz w:val="24"/>
+          <w:szCs w:val="24"/>
+        </w:rPr>
+        <w:t xml:space="preserve"> </w:t>
+      </w:r>
+      <w:r>
+        <w:rPr>
+          <w:rFonts w:ascii="Arial Narrow" w:hAnsi="Arial Narrow"/>
+          <w:sz w:val="24"/>
+          <w:szCs w:val="24"/>
+        </w:rPr>
+        <w:t xml:space="preserve">Kelamin</w:t>
+      </w:r>
+      <w:r>
+        <w:rPr>
+          <w:rFonts w:ascii="Arial Narrow" w:hAnsi="Arial Narrow"/>
+          <w:sz w:val="24"/>
+          <w:szCs w:val="24"/>
+        </w:rPr>
+        <w:tab/>
+      </w:r>
+      <w:r>
+        <w:rPr>
+          <w:rFonts w:ascii="Arial Narrow" w:hAnsi="Arial Narrow"/>
+          <w:sz w:val="24"/>
+          <w:szCs w:val="24"/>
+        </w:rPr>
+        <w:tab/>
+      </w:r>
+      <w:r>
+        <w:rPr>
+          <w:rFonts w:ascii="Arial Narrow" w:hAnsi="Arial Narrow"/>
+          <w:sz w:val="24"/>
+          <w:szCs w:val="24"/>
+        </w:rPr>
+        <w:tab/>
+        <w:t xml:space="preserve">:  </w:t>
+      </w:r>
+      <w:r>
+        <w:rPr>
+          <w:rFonts w:ascii="Arial Narrow" w:hAnsi="Arial Narrow"/>
+          <w:sz w:val="24"/>
+          <w:szCs w:val="24"/>
+        </w:rPr>
+      </w:r>
+      <w:r>
+        <w:rPr>
+          <w:rFonts w:ascii="Arial Narrow" w:hAnsi="Arial Narrow" w:cs="Times New Roman"/>
+          <w:b/>
+          <w:sz w:val="24"/>
+          <w:szCs w:val="24"/>
+        </w:rPr>
+      </w:r>
+    </w:p>
+    <w:p>
+      <w:pPr>
+        <w:pBdr/>
+        <w:spacing w:after="0"/>
+        <w:ind w:firstLine="720"/>
+        <w:jc w:val="both"/>
+        <w:rPr>
+          <w:rFonts w:ascii="Arial Narrow" w:hAnsi="Arial Narrow"/>
+          <w:sz w:val="24"/>
+          <w:szCs w:val="24"/>
+        </w:rPr>
+      </w:pPr>
+      <w:r>
+        <w:rPr>
+          <w:rFonts w:ascii="Arial Narrow" w:hAnsi="Arial Narrow"/>
+          <w:sz w:val="24"/>
+          <w:szCs w:val="24"/>
+        </w:rPr>
+        <w:t xml:space="preserve">Tempat</w:t>
+      </w:r>
+      <w:r>
+        <w:rPr>
+          <w:rFonts w:ascii="Arial Narrow" w:hAnsi="Arial Narrow"/>
+          <w:sz w:val="24"/>
+          <w:szCs w:val="24"/>
+        </w:rPr>
+        <w:t xml:space="preserve">/</w:t>
+      </w:r>
+      <w:r>
+        <w:rPr>
+          <w:rFonts w:ascii="Arial Narrow" w:hAnsi="Arial Narrow"/>
+          <w:sz w:val="24"/>
+          <w:szCs w:val="24"/>
+        </w:rPr>
+        <w:t xml:space="preserve">Tanggal</w:t>
+      </w:r>
+      <w:r>
+        <w:rPr>
+          <w:rFonts w:ascii="Arial Narrow" w:hAnsi="Arial Narrow"/>
+          <w:sz w:val="24"/>
+          <w:szCs w:val="24"/>
+        </w:rPr>
+        <w:t xml:space="preserve"> </w:t>
+      </w:r>
+      <w:r>
+        <w:rPr>
+          <w:rFonts w:ascii="Arial Narrow" w:hAnsi="Arial Narrow"/>
+          <w:sz w:val="24"/>
+          <w:szCs w:val="24"/>
+        </w:rPr>
+        <w:t xml:space="preserve">Lahir</w:t>
+      </w:r>
+      <w:r>
+        <w:rPr>
+          <w:rFonts w:ascii="Arial Narrow" w:hAnsi="Arial Narrow"/>
+          <w:sz w:val="24"/>
+          <w:szCs w:val="24"/>
+        </w:rPr>
+        <w:tab/>
+      </w:r>
+      <w:r>
+        <w:rPr>
+          <w:rFonts w:ascii="Arial Narrow" w:hAnsi="Arial Narrow"/>
+          <w:sz w:val="24"/>
+          <w:szCs w:val="24"/>
+        </w:rPr>
+        <w:tab/>
+        <w:t xml:space="preserve">:  </w:t>
+      </w:r>
+      <w:r>
+        <w:rPr>
+          <w:rFonts w:ascii="Arial Narrow" w:hAnsi="Arial Narrow"/>
+          <w:sz w:val="24"/>
+          <w:szCs w:val="24"/>
+        </w:rPr>
+      </w:r>
+    </w:p>
+    <w:p>
+      <w:pPr>
+        <w:pBdr/>
+        <w:spacing w:after="0"/>
+        <w:ind w:firstLine="720"/>
+        <w:jc w:val="both"/>
+        <w:rPr>
+          <w:rFonts w:ascii="Arial Narrow" w:hAnsi="Arial Narrow"/>
+          <w:sz w:val="24"/>
+          <w:szCs w:val="24"/>
+        </w:rPr>
+      </w:pPr>
+      <w:r>
+        <w:rPr>
+          <w:rFonts w:ascii="Arial Narrow" w:hAnsi="Arial Narrow"/>
+          <w:sz w:val="24"/>
+          <w:szCs w:val="24"/>
+        </w:rPr>
+        <w:t xml:space="preserve">NIK</w:t>
+      </w:r>
+      <w:r>
+        <w:rPr>
+          <w:rFonts w:ascii="Arial Narrow" w:hAnsi="Arial Narrow"/>
+          <w:sz w:val="24"/>
+          <w:szCs w:val="24"/>
+        </w:rPr>
+        <w:tab/>
+      </w:r>
+      <w:r>
+        <w:rPr>
+          <w:rFonts w:ascii="Arial Narrow" w:hAnsi="Arial Narrow"/>
+          <w:sz w:val="24"/>
+          <w:szCs w:val="24"/>
+        </w:rPr>
+        <w:tab/>
+      </w:r>
+      <w:r>
+        <w:rPr>
+          <w:rFonts w:ascii="Arial Narrow" w:hAnsi="Arial Narrow"/>
+          <w:sz w:val="24"/>
+          <w:szCs w:val="24"/>
+        </w:rPr>
+        <w:tab/>
+      </w:r>
+      <w:r>
+        <w:rPr>
+          <w:rFonts w:ascii="Arial Narrow" w:hAnsi="Arial Narrow"/>
+          <w:sz w:val="24"/>
+          <w:szCs w:val="24"/>
+        </w:rPr>
+        <w:tab/>
+        <w:tab/>
+        <w:t xml:space="preserve">:  </w:t>
+      </w:r>
+      <w:r>
+        <w:rPr>
+          <w:rFonts w:ascii="Arial Narrow" w:hAnsi="Arial Narrow"/>
+          <w:sz w:val="24"/>
+          <w:szCs w:val="24"/>
+        </w:rPr>
+      </w:r>
+    </w:p>
+    <w:p>
+      <w:pPr>
+        <w:pBdr/>
+        <w:spacing w:after="0"/>
+        <w:ind w:firstLine="720"/>
+        <w:jc w:val="both"/>
+        <w:rPr>
+          <w:rFonts w:ascii="Arial Narrow" w:hAnsi="Arial Narrow"/>
+          <w:sz w:val="24"/>
+          <w:szCs w:val="24"/>
+        </w:rPr>
+      </w:pPr>
+      <w:r>
+        <w:rPr>
+          <w:rFonts w:ascii="Arial Narrow" w:hAnsi="Arial Narrow"/>
+          <w:sz w:val="24"/>
+          <w:szCs w:val="24"/>
+        </w:rPr>
+        <w:t xml:space="preserve">Kewarganegaraan</w:t>
+      </w:r>
+      <w:r>
+        <w:rPr>
+          <w:rFonts w:ascii="Arial Narrow" w:hAnsi="Arial Narrow"/>
+          <w:sz w:val="24"/>
+          <w:szCs w:val="24"/>
+        </w:rPr>
+        <w:tab/>
+      </w:r>
+      <w:r>
+        <w:rPr>
+          <w:rFonts w:ascii="Arial Narrow" w:hAnsi="Arial Narrow"/>
+          <w:sz w:val="24"/>
+          <w:szCs w:val="24"/>
+        </w:rPr>
+        <w:tab/>
+        <w:tab/>
+        <w:t xml:space="preserve">:  </w:t>
+      </w:r>
+      <w:r>
+        <w:rPr>
+          <w:rFonts w:ascii="Arial Narrow" w:hAnsi="Arial Narrow"/>
+          <w:sz w:val="24"/>
+          <w:szCs w:val="24"/>
+        </w:rPr>
+      </w:r>
+    </w:p>
+    <w:p>
+      <w:pPr>
+        <w:pBdr/>
+        <w:spacing w:after="0"/>
+        <w:ind w:firstLine="720"/>
+        <w:jc w:val="both"/>
+        <w:rPr>
+          <w:rFonts w:ascii="Arial Narrow" w:hAnsi="Arial Narrow"/>
+          <w:sz w:val="24"/>
+          <w:szCs w:val="24"/>
+        </w:rPr>
+      </w:pPr>
+      <w:r>
+        <w:rPr>
+          <w:rFonts w:ascii="Arial Narrow" w:hAnsi="Arial Narrow"/>
+          <w:sz w:val="24"/>
+          <w:szCs w:val="24"/>
+        </w:rPr>
+        <w:t xml:space="preserve">Agama</w:t>
+      </w:r>
+      <w:r>
+        <w:rPr>
+          <w:rFonts w:ascii="Arial Narrow" w:hAnsi="Arial Narrow"/>
+          <w:sz w:val="24"/>
+          <w:szCs w:val="24"/>
+        </w:rPr>
+        <w:tab/>
+      </w:r>
+      <w:r>
+        <w:rPr>
+          <w:rFonts w:ascii="Arial Narrow" w:hAnsi="Arial Narrow"/>
+          <w:sz w:val="24"/>
+          <w:szCs w:val="24"/>
+        </w:rPr>
+        <w:tab/>
+      </w:r>
+      <w:r>
+        <w:rPr>
+          <w:rFonts w:ascii="Arial Narrow" w:hAnsi="Arial Narrow"/>
+          <w:sz w:val="24"/>
+          <w:szCs w:val="24"/>
+        </w:rPr>
+        <w:tab/>
+      </w:r>
+      <w:r>
+        <w:rPr>
+          <w:rFonts w:ascii="Arial Narrow" w:hAnsi="Arial Narrow"/>
+          <w:sz w:val="24"/>
+          <w:szCs w:val="24"/>
+        </w:rPr>
+        <w:tab/>
+        <w:t xml:space="preserve">:  </w:t>
+      </w:r>
+      <w:r>
+        <w:rPr>
+          <w:rFonts w:ascii="Arial Narrow" w:hAnsi="Arial Narrow"/>
+          <w:sz w:val="24"/>
+          <w:szCs w:val="24"/>
+        </w:rPr>
+      </w:r>
+    </w:p>
+    <w:p>
+      <w:pPr>
+        <w:pBdr/>
+        <w:spacing w:after="0"/>
+        <w:ind w:firstLine="720"/>
+        <w:jc w:val="both"/>
+        <w:rPr>
+          <w:rFonts w:ascii="Arial Narrow" w:hAnsi="Arial Narrow"/>
+          <w:sz w:val="24"/>
+          <w:szCs w:val="24"/>
+        </w:rPr>
+      </w:pPr>
+      <w:r>
+        <w:rPr>
+          <w:rFonts w:ascii="Arial Narrow" w:hAnsi="Arial Narrow"/>
+          <w:sz w:val="24"/>
+          <w:szCs w:val="24"/>
+        </w:rPr>
+        <w:t xml:space="preserve">Alamat</w:t>
+      </w:r>
+      <w:r>
+        <w:rPr>
+          <w:rFonts w:ascii="Arial Narrow" w:hAnsi="Arial Narrow"/>
+          <w:sz w:val="24"/>
+          <w:szCs w:val="24"/>
+        </w:rPr>
+        <w:tab/>
+      </w:r>
+      <w:r>
+        <w:rPr>
+          <w:rFonts w:ascii="Arial Narrow" w:hAnsi="Arial Narrow"/>
+          <w:sz w:val="24"/>
+          <w:szCs w:val="24"/>
+        </w:rPr>
+        <w:tab/>
+      </w:r>
+      <w:r>
+        <w:rPr>
+          <w:rFonts w:ascii="Arial Narrow" w:hAnsi="Arial Narrow"/>
+          <w:sz w:val="24"/>
+          <w:szCs w:val="24"/>
+        </w:rPr>
+        <w:tab/>
+      </w:r>
+      <w:r>
+        <w:rPr>
+          <w:rFonts w:ascii="Arial Narrow" w:hAnsi="Arial Narrow"/>
+          <w:sz w:val="24"/>
+          <w:szCs w:val="24"/>
+        </w:rPr>
+        <w:tab/>
+        <w:t xml:space="preserve">: </w:t>
+      </w:r>
+      <w:r>
+        <w:rPr>
+          <w:rFonts w:ascii="Arial Narrow" w:hAnsi="Arial Narrow"/>
+          <w:sz w:val="24"/>
+          <w:szCs w:val="24"/>
+        </w:rPr>
+        <w:t xml:space="preserve"> </w:t>
+      </w:r>
+      <w:r>
+        <w:rPr>
+          <w:rFonts w:ascii="Arial Narrow" w:hAnsi="Arial Narrow"/>
+          <w:sz w:val="24"/>
+          <w:szCs w:val="24"/>
+        </w:rPr>
+      </w:r>
+    </w:p>
+    <w:p>
+      <w:pPr>
+        <w:pBdr/>
+        <w:spacing w:after="0" w:line="240" w:lineRule="auto"/>
+        <w:ind w:firstLine="720"/>
+        <w:jc w:val="both"/>
+        <w:rPr>
+          <w:rFonts w:ascii="Arial Narrow" w:hAnsi="Arial Narrow"/>
+          <w:sz w:val="12"/>
+          <w:szCs w:val="24"/>
+        </w:rPr>
+      </w:pPr>
+      <w:r>
+        <w:rPr>
+          <w:rFonts w:ascii="Arial Narrow" w:hAnsi="Arial Narrow"/>
+          <w:sz w:val="12"/>
+          <w:szCs w:val="24"/>
+        </w:rPr>
+      </w:r>
+      <w:r>
+        <w:rPr>
+          <w:rFonts w:ascii="Arial Narrow" w:hAnsi="Arial Narrow"/>
+          <w:sz w:val="12"/>
+          <w:szCs w:val="24"/>
+        </w:rPr>
+      </w:r>
+    </w:p>
+    <w:p>
+      <w:pPr>
+        <w:pBdr/>
+        <w:spacing w:after="0" w:line="240" w:lineRule="auto"/>
+        <w:ind w:firstLine="720"/>
+        <w:jc w:val="both"/>
+        <w:rPr>
+          <w:rFonts w:ascii="Arial Narrow" w:hAnsi="Arial Narrow"/>
+          <w:sz w:val="24"/>
+          <w:szCs w:val="24"/>
+        </w:rPr>
+      </w:pPr>
+      <w:r>
+        <w:rPr>
+          <w:rFonts w:ascii="Arial Narrow" w:hAnsi="Arial Narrow"/>
+          <w:sz w:val="24"/>
+          <w:szCs w:val="24"/>
+        </w:rPr>
+        <w:t xml:space="preserve">Nama</w:t>
+      </w:r>
+      <w:r>
+        <w:rPr>
+          <w:rFonts w:ascii="Arial Narrow" w:hAnsi="Arial Narrow"/>
+          <w:sz w:val="24"/>
+          <w:szCs w:val="24"/>
+        </w:rPr>
+        <w:t xml:space="preserve"> Orang </w:t>
+      </w:r>
+      <w:r>
+        <w:rPr>
+          <w:rFonts w:ascii="Arial Narrow" w:hAnsi="Arial Narrow"/>
+          <w:sz w:val="24"/>
+          <w:szCs w:val="24"/>
+        </w:rPr>
+        <w:t xml:space="preserve">Tua</w:t>
+      </w:r>
+      <w:r>
+        <w:rPr>
+          <w:rFonts w:ascii="Arial Narrow" w:hAnsi="Arial Narrow"/>
+          <w:sz w:val="24"/>
+          <w:szCs w:val="24"/>
+        </w:rPr>
+        <w:tab/>
+      </w:r>
+      <w:r>
+        <w:rPr>
+          <w:rFonts w:ascii="Arial Narrow" w:hAnsi="Arial Narrow"/>
+          <w:sz w:val="24"/>
+          <w:szCs w:val="24"/>
+        </w:rPr>
+      </w:r>
+    </w:p>
+    <w:p>
+      <w:pPr>
+        <w:pBdr/>
+        <w:spacing w:after="0" w:line="240" w:lineRule="auto"/>
+        <w:ind w:firstLine="720"/>
+        <w:jc w:val="both"/>
+        <w:rPr>
+          <w:rFonts w:ascii="Arial Narrow" w:hAnsi="Arial Narrow"/>
+          <w:b/>
+          <w:sz w:val="24"/>
+          <w:szCs w:val="24"/>
+        </w:rPr>
+      </w:pPr>
+      <w:r>
+        <w:rPr>
+          <w:rFonts w:ascii="Arial Narrow" w:hAnsi="Arial Narrow"/>
+          <w:sz w:val="24"/>
+          <w:szCs w:val="24"/>
+        </w:rPr>
+        <w:t xml:space="preserve">Ayah</w:t>
+      </w:r>
+      <w:r>
+        <w:rPr>
+          <w:rFonts w:ascii="Arial Narrow" w:hAnsi="Arial Narrow"/>
+          <w:sz w:val="24"/>
+          <w:szCs w:val="24"/>
+        </w:rPr>
+        <w:tab/>
+      </w:r>
+      <w:r>
+        <w:rPr>
+          <w:rFonts w:ascii="Arial Narrow" w:hAnsi="Arial Narrow"/>
+          <w:sz w:val="24"/>
+          <w:szCs w:val="24"/>
+        </w:rPr>
+        <w:tab/>
+      </w:r>
+      <w:r>
+        <w:rPr>
+          <w:rFonts w:ascii="Arial Narrow" w:hAnsi="Arial Narrow"/>
+          <w:sz w:val="24"/>
+          <w:szCs w:val="24"/>
+        </w:rPr>
+        <w:tab/>
+      </w:r>
+      <w:r>
+        <w:rPr>
+          <w:rFonts w:ascii="Arial Narrow" w:hAnsi="Arial Narrow"/>
+          <w:sz w:val="24"/>
+          <w:szCs w:val="24"/>
+        </w:rPr>
+        <w:tab/>
+        <w:tab/>
+        <w:t xml:space="preserve">: </w:t>
+      </w:r>
+      <w:r>
+        <w:rPr>
+          <w:rFonts w:ascii="Arial Narrow" w:hAnsi="Arial Narrow"/>
+          <w:sz w:val="24"/>
+          <w:szCs w:val="24"/>
+        </w:rPr>
+        <w:t xml:space="preserve"> </w:t>
+      </w:r>
+      <w:r>
+        <w:rPr>
+          <w:rFonts w:ascii="Arial Narrow" w:hAnsi="Arial Narrow"/>
+          <w:b/>
+          <w:sz w:val="24"/>
+          <w:szCs w:val="24"/>
+        </w:rPr>
+      </w:r>
+    </w:p>
+    <w:p>
+      <w:pPr>
+        <w:pBdr/>
+        <w:spacing w:after="0" w:line="240" w:lineRule="auto"/>
+        <w:ind w:firstLine="720"/>
+        <w:jc w:val="both"/>
+        <w:rPr>
+          <w:rFonts w:ascii="Arial Narrow" w:hAnsi="Arial Narrow"/>
+          <w:b/>
+          <w:sz w:val="24"/>
+          <w:szCs w:val="24"/>
+        </w:rPr>
+      </w:pPr>
+      <w:r>
+        <w:rPr>
+          <w:rFonts w:ascii="Arial Narrow" w:hAnsi="Arial Narrow"/>
+          <w:sz w:val="24"/>
+          <w:szCs w:val="24"/>
+        </w:rPr>
+        <w:t xml:space="preserve">Ibu</w:t>
+      </w:r>
+      <w:r>
+        <w:rPr>
+          <w:rFonts w:ascii="Arial Narrow" w:hAnsi="Arial Narrow"/>
+          <w:sz w:val="24"/>
+          <w:szCs w:val="24"/>
+        </w:rPr>
+        <w:tab/>
+      </w:r>
+      <w:r>
+        <w:rPr>
+          <w:rFonts w:ascii="Arial Narrow" w:hAnsi="Arial Narrow"/>
+          <w:sz w:val="24"/>
+          <w:szCs w:val="24"/>
+        </w:rPr>
+        <w:tab/>
+      </w:r>
+      <w:r>
+        <w:rPr>
+          <w:rFonts w:ascii="Arial Narrow" w:hAnsi="Arial Narrow"/>
+          <w:sz w:val="24"/>
+          <w:szCs w:val="24"/>
+        </w:rPr>
+        <w:tab/>
+      </w:r>
+      <w:r>
+        <w:rPr>
+          <w:rFonts w:ascii="Arial Narrow" w:hAnsi="Arial Narrow"/>
+          <w:sz w:val="24"/>
+          <w:szCs w:val="24"/>
+        </w:rPr>
+        <w:tab/>
+        <w:tab/>
+        <w:t xml:space="preserve">:  </w:t>
+      </w:r>
+      <w:r>
+        <w:rPr>
+          <w:rFonts w:ascii="Arial Narrow" w:hAnsi="Arial Narrow"/>
+          <w:b/>
+          <w:sz w:val="24"/>
+          <w:szCs w:val="24"/>
+        </w:rPr>
+      </w:r>
+    </w:p>
+    <w:p>
+      <w:pPr>
+        <w:pBdr/>
+        <w:spacing w:after="0" w:line="240" w:lineRule="auto"/>
+        <w:ind w:firstLine="720"/>
+        <w:jc w:val="both"/>
+        <w:rPr>
+          <w:rFonts w:ascii="Arial Narrow" w:hAnsi="Arial Narrow"/>
+          <w:sz w:val="24"/>
+          <w:szCs w:val="24"/>
+        </w:rPr>
+      </w:pPr>
+      <w:r>
+        <w:rPr>
+          <w:rFonts w:ascii="Arial Narrow" w:hAnsi="Arial Narrow"/>
+          <w:sz w:val="24"/>
+          <w:szCs w:val="24"/>
+        </w:rPr>
+        <w:t xml:space="preserve">NIK KK</w:t>
+      </w:r>
+      <w:r>
+        <w:rPr>
+          <w:rFonts w:ascii="Arial Narrow" w:hAnsi="Arial Narrow"/>
+          <w:sz w:val="24"/>
+          <w:szCs w:val="24"/>
+        </w:rPr>
+        <w:tab/>
+      </w:r>
+      <w:r>
+        <w:rPr>
+          <w:rFonts w:ascii="Arial Narrow" w:hAnsi="Arial Narrow"/>
+          <w:sz w:val="24"/>
+          <w:szCs w:val="24"/>
+        </w:rPr>
+        <w:tab/>
+      </w:r>
+      <w:r>
+        <w:rPr>
+          <w:rFonts w:ascii="Arial Narrow" w:hAnsi="Arial Narrow"/>
+          <w:sz w:val="24"/>
+          <w:szCs w:val="24"/>
+        </w:rPr>
+        <w:tab/>
+      </w:r>
+      <w:r>
+        <w:rPr>
+          <w:rFonts w:ascii="Arial Narrow" w:hAnsi="Arial Narrow"/>
+          <w:sz w:val="24"/>
+          <w:szCs w:val="24"/>
+        </w:rPr>
+        <w:tab/>
+        <w:t xml:space="preserve">:  </w:t>
+      </w:r>
+      <w:r>
+        <w:rPr>
+          <w:rFonts w:ascii="Arial Narrow" w:hAnsi="Arial Narrow"/>
+          <w:sz w:val="24"/>
+          <w:szCs w:val="24"/>
+        </w:rPr>
+      </w:r>
+    </w:p>
+    <w:p>
+      <w:pPr>
+        <w:pStyle w:val="762"/>
+        <w:pBdr/>
+        <w:spacing w:after="0" w:line="240" w:lineRule="auto"/>
+        <w:ind w:left="1080"/>
+        <w:jc w:val="both"/>
+        <w:rPr>
+          <w:rFonts w:ascii="Arial Narrow" w:hAnsi="Arial Narrow"/>
+          <w:sz w:val="16"/>
+          <w:szCs w:val="24"/>
+        </w:rPr>
+      </w:pPr>
+      <w:r>
+        <w:rPr>
+          <w:rFonts w:ascii="Arial Narrow" w:hAnsi="Arial Narrow"/>
+          <w:sz w:val="16"/>
+          <w:szCs w:val="24"/>
+        </w:rPr>
+      </w:r>
+      <w:r>
+        <w:rPr>
+          <w:rFonts w:ascii="Arial Narrow" w:hAnsi="Arial Narrow"/>
+          <w:sz w:val="16"/>
+          <w:szCs w:val="24"/>
+        </w:rPr>
+      </w:r>
+    </w:p>
+    <w:p>
+      <w:pPr>
+        <w:pBdr/>
+        <w:spacing w:after="0" w:line="240" w:lineRule="auto"/>
+        <w:ind w:firstLine="720"/>
+        <w:jc w:val="both"/>
+        <w:rPr>
+          <w:rFonts w:ascii="Arial Narrow" w:hAnsi="Arial Narrow"/>
+          <w:sz w:val="24"/>
+          <w:szCs w:val="24"/>
+        </w:rPr>
+      </w:pPr>
+      <w:r>
+        <w:rPr>
+          <w:rFonts w:ascii="Arial Narrow" w:hAnsi="Arial Narrow"/>
+          <w:sz w:val="24"/>
+          <w:szCs w:val="24"/>
+        </w:rPr>
+        <w:t xml:space="preserve">Berdas</w:t>
+      </w:r>
+      <w:r>
+        <w:rPr>
+          <w:rFonts w:ascii="Arial Narrow" w:hAnsi="Arial Narrow"/>
+          <w:sz w:val="24"/>
+          <w:szCs w:val="24"/>
+        </w:rPr>
+        <w:t xml:space="preserve">a</w:t>
+      </w:r>
+      <w:r>
+        <w:rPr>
+          <w:rFonts w:ascii="Arial Narrow" w:hAnsi="Arial Narrow"/>
+          <w:sz w:val="24"/>
+          <w:szCs w:val="24"/>
+        </w:rPr>
+        <w:t xml:space="preserve">rka</w:t>
+      </w:r>
+      <w:r>
+        <w:rPr>
+          <w:rFonts w:ascii="Arial Narrow" w:hAnsi="Arial Narrow"/>
+          <w:sz w:val="24"/>
+          <w:szCs w:val="24"/>
+        </w:rPr>
+        <w:t xml:space="preserve">n</w:t>
+      </w:r>
+      <w:r>
+        <w:rPr>
+          <w:rFonts w:ascii="Arial Narrow" w:hAnsi="Arial Narrow"/>
+          <w:sz w:val="24"/>
+          <w:szCs w:val="24"/>
+        </w:rPr>
+        <w:t xml:space="preserve"> </w:t>
+      </w:r>
+      <w:r>
+        <w:rPr>
+          <w:rFonts w:ascii="Arial Narrow" w:hAnsi="Arial Narrow"/>
+          <w:sz w:val="24"/>
+          <w:szCs w:val="24"/>
+        </w:rPr>
+        <w:t xml:space="preserve">Surat</w:t>
+      </w:r>
+      <w:r>
+        <w:rPr>
+          <w:rFonts w:ascii="Arial Narrow" w:hAnsi="Arial Narrow"/>
+          <w:sz w:val="24"/>
+          <w:szCs w:val="24"/>
+        </w:rPr>
+        <w:t xml:space="preserve"> </w:t>
+      </w:r>
+      <w:r>
+        <w:rPr>
+          <w:rFonts w:ascii="Arial Narrow" w:hAnsi="Arial Narrow"/>
+          <w:sz w:val="24"/>
+          <w:szCs w:val="24"/>
+        </w:rPr>
+        <w:t xml:space="preserve">Pengantar</w:t>
+      </w:r>
+      <w:r>
+        <w:rPr>
+          <w:rFonts w:ascii="Arial Narrow" w:hAnsi="Arial Narrow"/>
+          <w:sz w:val="24"/>
+          <w:szCs w:val="24"/>
+        </w:rPr>
+        <w:t xml:space="preserve"> </w:t>
+      </w:r>
+      <w:r>
+        <w:rPr>
+          <w:rFonts w:ascii="Arial Narrow" w:hAnsi="Arial Narrow"/>
+          <w:sz w:val="24"/>
+          <w:szCs w:val="24"/>
+        </w:rPr>
+        <w:t xml:space="preserve">dari</w:t>
+      </w:r>
+      <w:r>
+        <w:rPr>
+          <w:rFonts w:ascii="Arial Narrow" w:hAnsi="Arial Narrow"/>
+          <w:sz w:val="24"/>
+          <w:szCs w:val="24"/>
+        </w:rPr>
+        <w:t xml:space="preserve"> </w:t>
+      </w:r>
+      <w:r>
+        <w:rPr>
+          <w:rFonts w:ascii="Arial Narrow" w:hAnsi="Arial Narrow"/>
+          <w:sz w:val="24"/>
+          <w:szCs w:val="24"/>
+        </w:rPr>
+        <w:t xml:space="preserve">Ketua</w:t>
+      </w:r>
+      <w:r>
+        <w:rPr>
+          <w:rFonts w:ascii="Arial Narrow" w:hAnsi="Arial Narrow"/>
+          <w:sz w:val="24"/>
+          <w:szCs w:val="24"/>
+        </w:rPr>
+        <w:t xml:space="preserve"> RT.     RW.</w:t>
+      </w:r>
+      <w:r>
+        <w:rPr>
+          <w:rFonts w:ascii="Arial Narrow" w:hAnsi="Arial Narrow"/>
+          <w:sz w:val="24"/>
+          <w:szCs w:val="24"/>
+        </w:rPr>
+      </w:r>
+    </w:p>
+    <w:p>
+      <w:pPr>
+        <w:pBdr/>
+        <w:spacing w:after="0" w:line="240" w:lineRule="auto"/>
+        <w:ind w:left="720"/>
+        <w:jc w:val="both"/>
+        <w:rPr>
+          <w:rFonts w:ascii="Arial Narrow" w:hAnsi="Arial Narrow"/>
+          <w:sz w:val="24"/>
+          <w:szCs w:val="24"/>
+        </w:rPr>
+      </w:pPr>
+      <w:r>
+        <w:rPr>
+          <w:rFonts w:ascii="Arial Narrow" w:hAnsi="Arial Narrow"/>
+          <w:sz w:val="24"/>
+          <w:szCs w:val="24"/>
+        </w:rPr>
+        <w:t xml:space="preserve">Nomor </w:t>
+      </w:r>
+      <w:r>
+        <w:rPr>
+          <w:rFonts w:ascii="Arial Narrow" w:hAnsi="Arial Narrow"/>
+          <w:sz w:val="24"/>
+          <w:szCs w:val="24"/>
+        </w:rPr>
+        <w:t xml:space="preserve">/ </w:t>
+      </w:r>
+      <w:r>
+        <w:rPr>
+          <w:rFonts w:ascii="Arial Narrow" w:hAnsi="Arial Narrow"/>
+          <w:sz w:val="24"/>
+          <w:szCs w:val="24"/>
+        </w:rPr>
+        <w:t xml:space="preserve">Tanggal</w:t>
+      </w:r>
+      <w:r>
+        <w:rPr>
+          <w:rFonts w:ascii="Arial Narrow" w:hAnsi="Arial Narrow"/>
+          <w:sz w:val="24"/>
+          <w:szCs w:val="24"/>
+        </w:rPr>
+        <w:tab/>
+      </w:r>
+      <w:r>
+        <w:rPr>
+          <w:rFonts w:ascii="Arial Narrow" w:hAnsi="Arial Narrow"/>
+          <w:sz w:val="24"/>
+          <w:szCs w:val="24"/>
+        </w:rPr>
+        <w:tab/>
+        <w:tab/>
+        <w:t xml:space="preserve">: </w:t>
+      </w:r>
+      <w:r>
+        <w:rPr>
+          <w:rFonts w:ascii="Arial Narrow" w:hAnsi="Arial Narrow"/>
+          <w:sz w:val="24"/>
+          <w:szCs w:val="24"/>
+        </w:rPr>
+        <w:t xml:space="preserve">              /   /   /2026</w:t>
+      </w:r>
+      <w:r>
+        <w:rPr>
+          <w:rFonts w:ascii="Arial Narrow" w:hAnsi="Arial Narrow"/>
+          <w:sz w:val="24"/>
+          <w:szCs w:val="24"/>
+        </w:rPr>
+      </w:r>
+    </w:p>
+    <w:p>
+      <w:pPr>
+        <w:pBdr/>
+        <w:spacing w:after="0" w:line="240" w:lineRule="auto"/>
+        <w:ind w:left="720"/>
+        <w:jc w:val="both"/>
+        <w:rPr>
+          <w:rFonts w:ascii="Arial Narrow" w:hAnsi="Arial Narrow"/>
+          <w:sz w:val="14"/>
+          <w:szCs w:val="24"/>
+        </w:rPr>
+      </w:pPr>
+      <w:r>
+        <w:rPr>
+          <w:rFonts w:ascii="Arial Narrow" w:hAnsi="Arial Narrow"/>
+          <w:sz w:val="14"/>
+          <w:szCs w:val="24"/>
+        </w:rPr>
+      </w:r>
+      <w:r>
+        <w:rPr>
+          <w:rFonts w:ascii="Arial Narrow" w:hAnsi="Arial Narrow"/>
+          <w:sz w:val="14"/>
+          <w:szCs w:val="24"/>
+        </w:rPr>
+      </w:r>
+    </w:p>
+    <w:p>
+      <w:pPr>
+        <w:pBdr/>
+        <w:spacing w:after="0"/>
+        <w:ind w:firstLine="720"/>
+        <w:jc w:val="both"/>
+        <w:rPr>
+          <w:rFonts w:ascii="Arial Narrow" w:hAnsi="Arial Narrow"/>
+          <w:sz w:val="24"/>
+          <w:szCs w:val="24"/>
+        </w:rPr>
+      </w:pPr>
+      <w:r>
+        <w:rPr>
+          <w:rFonts w:ascii="Arial Narrow" w:hAnsi="Arial Narrow"/>
+          <w:sz w:val="24"/>
+          <w:szCs w:val="24"/>
+        </w:rPr>
+        <w:t xml:space="preserve">Bahwa</w:t>
+      </w:r>
+      <w:r>
+        <w:rPr>
+          <w:rFonts w:ascii="Arial Narrow" w:hAnsi="Arial Narrow"/>
+          <w:sz w:val="24"/>
+          <w:szCs w:val="24"/>
+        </w:rPr>
+        <w:t xml:space="preserve"> </w:t>
+      </w:r>
+      <w:r>
+        <w:rPr>
+          <w:rFonts w:ascii="Arial Narrow" w:hAnsi="Arial Narrow"/>
+          <w:sz w:val="24"/>
+          <w:szCs w:val="24"/>
+        </w:rPr>
+        <w:t xml:space="preserve">Nama</w:t>
+      </w:r>
+      <w:r>
+        <w:rPr>
+          <w:rFonts w:ascii="Arial Narrow" w:hAnsi="Arial Narrow"/>
+          <w:sz w:val="24"/>
+          <w:szCs w:val="24"/>
+        </w:rPr>
+        <w:t xml:space="preserve"> </w:t>
+      </w:r>
+      <w:r>
+        <w:rPr>
+          <w:rFonts w:ascii="Arial Narrow" w:hAnsi="Arial Narrow"/>
+          <w:sz w:val="24"/>
+          <w:szCs w:val="24"/>
+        </w:rPr>
+        <w:t xml:space="preserve">Tersebut</w:t>
+      </w:r>
+      <w:r>
+        <w:rPr>
+          <w:rFonts w:ascii="Arial Narrow" w:hAnsi="Arial Narrow"/>
+          <w:sz w:val="24"/>
+          <w:szCs w:val="24"/>
+        </w:rPr>
+        <w:t xml:space="preserve"> </w:t>
+      </w:r>
+      <w:r>
+        <w:rPr>
+          <w:rFonts w:ascii="Arial Narrow" w:hAnsi="Arial Narrow"/>
+          <w:sz w:val="24"/>
+          <w:szCs w:val="24"/>
+        </w:rPr>
+        <w:t xml:space="preserve">Diatas</w:t>
+      </w:r>
+      <w:r>
+        <w:rPr>
+          <w:rFonts w:ascii="Arial Narrow" w:hAnsi="Arial Narrow"/>
+          <w:sz w:val="24"/>
+          <w:szCs w:val="24"/>
+        </w:rPr>
+        <w:t xml:space="preserve"> Dari </w:t>
+      </w:r>
+      <w:r>
+        <w:rPr>
+          <w:rFonts w:ascii="Arial Narrow" w:hAnsi="Arial Narrow"/>
+          <w:sz w:val="24"/>
+          <w:szCs w:val="24"/>
+        </w:rPr>
+        <w:t xml:space="preserve">Keluarga</w:t>
+      </w:r>
+      <w:r>
+        <w:rPr>
+          <w:rFonts w:ascii="Arial Narrow" w:hAnsi="Arial Narrow"/>
+          <w:sz w:val="24"/>
+          <w:szCs w:val="24"/>
+        </w:rPr>
+        <w:t xml:space="preserve"> </w:t>
+      </w:r>
+      <w:r>
+        <w:rPr>
+          <w:rFonts w:ascii="Arial Narrow" w:hAnsi="Arial Narrow"/>
+          <w:sz w:val="24"/>
+          <w:szCs w:val="24"/>
+        </w:rPr>
+        <w:t xml:space="preserve">Tidak</w:t>
+      </w:r>
+      <w:r>
+        <w:rPr>
+          <w:rFonts w:ascii="Arial Narrow" w:hAnsi="Arial Narrow"/>
+          <w:sz w:val="24"/>
+          <w:szCs w:val="24"/>
+        </w:rPr>
+        <w:t xml:space="preserve"> </w:t>
+      </w:r>
+      <w:r>
+        <w:rPr>
+          <w:rFonts w:ascii="Arial Narrow" w:hAnsi="Arial Narrow"/>
+          <w:sz w:val="24"/>
+          <w:szCs w:val="24"/>
+        </w:rPr>
+        <w:t xml:space="preserve">Mampu</w:t>
+      </w:r>
+      <w:r>
+        <w:rPr>
+          <w:rFonts w:ascii="Arial Narrow" w:hAnsi="Arial Narrow"/>
+          <w:sz w:val="24"/>
+          <w:szCs w:val="24"/>
+        </w:rPr>
+        <w:t xml:space="preserve">/</w:t>
+      </w:r>
+      <w:r>
+        <w:rPr>
+          <w:rFonts w:ascii="Arial Narrow" w:hAnsi="Arial Narrow"/>
+          <w:sz w:val="24"/>
+          <w:szCs w:val="24"/>
+        </w:rPr>
+        <w:t xml:space="preserve">Pra</w:t>
+      </w:r>
+      <w:r>
+        <w:rPr>
+          <w:rFonts w:ascii="Arial Narrow" w:hAnsi="Arial Narrow"/>
+          <w:sz w:val="24"/>
+          <w:szCs w:val="24"/>
+        </w:rPr>
+        <w:t xml:space="preserve"> Sejahtera. </w:t>
+      </w:r>
+      <w:r>
+        <w:rPr>
+          <w:rFonts w:ascii="Arial Narrow" w:hAnsi="Arial Narrow"/>
+          <w:sz w:val="24"/>
+          <w:szCs w:val="24"/>
+        </w:rPr>
+        <w:t xml:space="preserve">Hingga</w:t>
+      </w:r>
+      <w:r>
+        <w:rPr>
+          <w:rFonts w:ascii="Arial Narrow" w:hAnsi="Arial Narrow"/>
+          <w:sz w:val="24"/>
+          <w:szCs w:val="24"/>
+        </w:rPr>
+        <w:t xml:space="preserve"> </w:t>
+      </w:r>
+      <w:r>
+        <w:rPr>
+          <w:rFonts w:ascii="Arial Narrow" w:hAnsi="Arial Narrow"/>
+          <w:sz w:val="24"/>
+          <w:szCs w:val="24"/>
+        </w:rPr>
+        <w:t xml:space="preserve">Dibuatkannya</w:t>
+      </w:r>
+      <w:r>
+        <w:rPr>
+          <w:rFonts w:ascii="Arial Narrow" w:hAnsi="Arial Narrow"/>
+          <w:sz w:val="24"/>
+          <w:szCs w:val="24"/>
+        </w:rPr>
+        <w:t xml:space="preserve"> </w:t>
+      </w:r>
+      <w:r>
+        <w:rPr>
+          <w:rFonts w:ascii="Arial Narrow" w:hAnsi="Arial Narrow"/>
+          <w:sz w:val="24"/>
+          <w:szCs w:val="24"/>
+        </w:rPr>
+        <w:t xml:space="preserve">Surat</w:t>
+      </w:r>
+      <w:r>
+        <w:rPr>
+          <w:rFonts w:ascii="Arial Narrow" w:hAnsi="Arial Narrow"/>
+          <w:sz w:val="24"/>
+          <w:szCs w:val="24"/>
+        </w:rPr>
+        <w:t xml:space="preserve"> </w:t>
+      </w:r>
+      <w:r>
+        <w:rPr>
+          <w:rFonts w:ascii="Arial Narrow" w:hAnsi="Arial Narrow"/>
+          <w:sz w:val="24"/>
+          <w:szCs w:val="24"/>
+        </w:rPr>
+        <w:t xml:space="preserve">Keterangan</w:t>
+      </w:r>
+      <w:r>
+        <w:rPr>
+          <w:rFonts w:ascii="Arial Narrow" w:hAnsi="Arial Narrow"/>
+          <w:sz w:val="24"/>
+          <w:szCs w:val="24"/>
+        </w:rPr>
+        <w:t xml:space="preserve"> </w:t>
+      </w:r>
+      <w:r>
+        <w:rPr>
+          <w:rFonts w:ascii="Arial Narrow" w:hAnsi="Arial Narrow"/>
+          <w:sz w:val="24"/>
+          <w:szCs w:val="24"/>
+        </w:rPr>
+        <w:t xml:space="preserve">Ini</w:t>
+      </w:r>
+      <w:r>
+        <w:rPr>
+          <w:rFonts w:ascii="Arial Narrow" w:hAnsi="Arial Narrow"/>
+          <w:sz w:val="24"/>
+          <w:szCs w:val="24"/>
+        </w:rPr>
+        <w:t xml:space="preserve"> </w:t>
+      </w:r>
+      <w:r>
+        <w:rPr>
+          <w:rFonts w:ascii="Arial Narrow" w:hAnsi="Arial Narrow"/>
+          <w:sz w:val="24"/>
+          <w:szCs w:val="24"/>
+        </w:rPr>
+        <w:t xml:space="preserve">Untuk</w:t>
+      </w:r>
+      <w:r>
+        <w:rPr>
+          <w:rFonts w:ascii="Arial Narrow" w:hAnsi="Arial Narrow"/>
+          <w:sz w:val="24"/>
+          <w:szCs w:val="24"/>
+        </w:rPr>
+        <w:t xml:space="preserve"> </w:t>
+      </w:r>
+      <w:r>
+        <w:rPr>
+          <w:rFonts w:ascii="Arial Narrow" w:hAnsi="Arial Narrow"/>
+          <w:sz w:val="24"/>
+          <w:szCs w:val="24"/>
+        </w:rPr>
+        <w:t xml:space="preserve">Keperluan</w:t>
+      </w:r>
+      <w:r>
+        <w:rPr>
+          <w:rFonts w:ascii="Arial Narrow" w:hAnsi="Arial Narrow"/>
+          <w:sz w:val="24"/>
+          <w:szCs w:val="24"/>
+        </w:rPr>
+        <w:t xml:space="preserve"> </w:t>
+      </w:r>
+      <w:r>
+        <w:rPr>
+          <w:rFonts w:ascii="Arial Narrow" w:hAnsi="Arial Narrow"/>
+          <w:sz w:val="24"/>
+          <w:szCs w:val="24"/>
+        </w:rPr>
+        <w:t xml:space="preserve">Administrasi</w:t>
+      </w:r>
+      <w:r>
+        <w:rPr>
+          <w:rFonts w:ascii="Arial Narrow" w:hAnsi="Arial Narrow"/>
+          <w:sz w:val="24"/>
+          <w:szCs w:val="24"/>
+        </w:rPr>
+        <w:t xml:space="preserve"> </w:t>
+      </w:r>
+      <w:r>
+        <w:rPr>
+          <w:rFonts w:ascii="Arial Narrow" w:hAnsi="Arial Narrow"/>
+          <w:sz w:val="24"/>
+          <w:szCs w:val="24"/>
+        </w:rPr>
+        <w:t xml:space="preserve">Pendidikan</w:t>
+      </w:r>
+      <w:r>
+        <w:rPr>
+          <w:rFonts w:ascii="Arial Narrow" w:hAnsi="Arial Narrow"/>
+          <w:sz w:val="24"/>
+          <w:szCs w:val="24"/>
+        </w:rPr>
+        <w:t xml:space="preserve"> </w:t>
+      </w:r>
+      <w:r>
+        <w:rPr>
+          <w:rFonts w:ascii="Arial Narrow" w:hAnsi="Arial Narrow"/>
+          <w:sz w:val="24"/>
+          <w:szCs w:val="24"/>
+        </w:rPr>
+        <w:t xml:space="preserve">Di :</w:t>
+      </w:r>
+      <w:r>
+        <w:rPr>
+          <w:rFonts w:ascii="Arial Narrow" w:hAnsi="Arial Narrow"/>
+          <w:sz w:val="24"/>
+          <w:szCs w:val="24"/>
+        </w:rPr>
+      </w:r>
+    </w:p>
+    <w:p>
+      <w:pPr>
+        <w:pBdr/>
+        <w:spacing w:after="0"/>
+        <w:ind/>
+        <w:jc w:val="center"/>
+        <w:rPr>
+          <w:rFonts w:ascii="Arial Narrow" w:hAnsi="Arial Narrow"/>
+          <w:sz w:val="24"/>
+          <w:szCs w:val="24"/>
+        </w:rPr>
+      </w:pPr>
+      <w:r>
+        <w:rPr>
+          <w:rFonts w:ascii="Arial Narrow" w:hAnsi="Arial Narrow"/>
+          <w:sz w:val="24"/>
+          <w:szCs w:val="24"/>
+        </w:rPr>
+        <w:t xml:space="preserve">------------------------</w:t>
+      </w:r>
+      <w:r>
+        <w:rPr>
+          <w:rFonts w:ascii="Arial Narrow" w:hAnsi="Arial Narrow"/>
+          <w:sz w:val="24"/>
+          <w:szCs w:val="24"/>
+        </w:rPr>
+        <w:t xml:space="preserve">---</w:t>
+      </w:r>
+      <w:r>
+        <w:rPr>
+          <w:rFonts w:ascii="Arial Narrow" w:hAnsi="Arial Narrow"/>
+          <w:b/>
+          <w:sz w:val="24"/>
+          <w:szCs w:val="24"/>
+        </w:rPr>
+        <w:t xml:space="preserve">                                                                           </w:t>
+      </w:r>
+      <w:r>
+        <w:rPr>
+          <w:rFonts w:ascii="Arial Narrow" w:hAnsi="Arial Narrow"/>
+          <w:sz w:val="24"/>
+          <w:szCs w:val="24"/>
+        </w:rPr>
+        <w:t xml:space="preserve">-----------------------</w:t>
+      </w:r>
+      <w:r>
+        <w:rPr>
+          <w:rFonts w:ascii="Arial Narrow" w:hAnsi="Arial Narrow"/>
+          <w:sz w:val="24"/>
+          <w:szCs w:val="24"/>
+        </w:rPr>
+      </w:r>
+    </w:p>
+    <w:p>
+      <w:pPr>
+        <w:pBdr/>
+        <w:spacing w:after="0"/>
+        <w:ind w:firstLine="720"/>
+        <w:jc w:val="both"/>
+        <w:rPr>
+          <w:rFonts w:ascii="Arial Narrow" w:hAnsi="Arial Narrow"/>
+          <w:sz w:val="24"/>
+          <w:szCs w:val="24"/>
+        </w:rPr>
+      </w:pPr>
+      <w:r>
+        <w:rPr>
+          <w:rFonts w:ascii="Arial Narrow" w:hAnsi="Arial Narrow"/>
+          <w:sz w:val="24"/>
+          <w:szCs w:val="24"/>
+        </w:rPr>
+        <w:t xml:space="preserve">Demikian</w:t>
+      </w:r>
+      <w:r>
+        <w:rPr>
+          <w:rFonts w:ascii="Arial Narrow" w:hAnsi="Arial Narrow"/>
+          <w:sz w:val="24"/>
+          <w:szCs w:val="24"/>
+        </w:rPr>
+        <w:t xml:space="preserve"> </w:t>
+      </w:r>
+      <w:r>
+        <w:rPr>
+          <w:rFonts w:ascii="Arial Narrow" w:hAnsi="Arial Narrow"/>
+          <w:sz w:val="24"/>
+          <w:szCs w:val="24"/>
+        </w:rPr>
+        <w:t xml:space="preserve">Surat</w:t>
+      </w:r>
+      <w:r>
+        <w:rPr>
+          <w:rFonts w:ascii="Arial Narrow" w:hAnsi="Arial Narrow"/>
+          <w:sz w:val="24"/>
+          <w:szCs w:val="24"/>
+        </w:rPr>
+        <w:t xml:space="preserve"> </w:t>
+      </w:r>
+      <w:r>
+        <w:rPr>
+          <w:rFonts w:ascii="Arial Narrow" w:hAnsi="Arial Narrow"/>
+          <w:sz w:val="24"/>
+          <w:szCs w:val="24"/>
+        </w:rPr>
+        <w:t xml:space="preserve">Keterangan</w:t>
+      </w:r>
+      <w:r>
+        <w:rPr>
+          <w:rFonts w:ascii="Arial Narrow" w:hAnsi="Arial Narrow"/>
+          <w:sz w:val="24"/>
+          <w:szCs w:val="24"/>
+        </w:rPr>
+        <w:t xml:space="preserve"> </w:t>
+      </w:r>
+      <w:r>
+        <w:rPr>
+          <w:rFonts w:ascii="Arial Narrow" w:hAnsi="Arial Narrow"/>
+          <w:sz w:val="24"/>
+          <w:szCs w:val="24"/>
+        </w:rPr>
+        <w:t xml:space="preserve">Keluarga</w:t>
+      </w:r>
+      <w:r>
+        <w:rPr>
+          <w:rFonts w:ascii="Arial Narrow" w:hAnsi="Arial Narrow"/>
+          <w:sz w:val="24"/>
+          <w:szCs w:val="24"/>
+        </w:rPr>
+        <w:t xml:space="preserve"> </w:t>
+      </w:r>
+      <w:r>
+        <w:rPr>
+          <w:rFonts w:ascii="Arial Narrow" w:hAnsi="Arial Narrow"/>
+          <w:sz w:val="24"/>
+          <w:szCs w:val="24"/>
+        </w:rPr>
+        <w:t xml:space="preserve">Miskin</w:t>
+      </w:r>
+      <w:r>
+        <w:rPr>
+          <w:rFonts w:ascii="Arial Narrow" w:hAnsi="Arial Narrow"/>
+          <w:sz w:val="24"/>
+          <w:szCs w:val="24"/>
+        </w:rPr>
+        <w:t xml:space="preserve"> </w:t>
+      </w:r>
+      <w:r>
+        <w:rPr>
+          <w:rFonts w:ascii="Arial Narrow" w:hAnsi="Arial Narrow"/>
+          <w:sz w:val="24"/>
+          <w:szCs w:val="24"/>
+        </w:rPr>
+        <w:t xml:space="preserve">ini</w:t>
+      </w:r>
+      <w:r>
+        <w:rPr>
+          <w:rFonts w:ascii="Arial Narrow" w:hAnsi="Arial Narrow"/>
+          <w:sz w:val="24"/>
+          <w:szCs w:val="24"/>
+        </w:rPr>
+        <w:t xml:space="preserve"> kami </w:t>
+      </w:r>
+      <w:r>
+        <w:rPr>
+          <w:rFonts w:ascii="Arial Narrow" w:hAnsi="Arial Narrow"/>
+          <w:sz w:val="24"/>
+          <w:szCs w:val="24"/>
+        </w:rPr>
+        <w:t xml:space="preserve">buat</w:t>
+      </w:r>
+      <w:r>
+        <w:rPr>
+          <w:rFonts w:ascii="Arial Narrow" w:hAnsi="Arial Narrow"/>
+          <w:sz w:val="24"/>
+          <w:szCs w:val="24"/>
+        </w:rPr>
+        <w:t xml:space="preserve"> agar yang </w:t>
+      </w:r>
+      <w:r>
+        <w:rPr>
+          <w:rFonts w:ascii="Arial Narrow" w:hAnsi="Arial Narrow"/>
+          <w:sz w:val="24"/>
+          <w:szCs w:val="24"/>
+        </w:rPr>
+        <w:t xml:space="preserve">berkepentingan</w:t>
+      </w:r>
+      <w:r>
+        <w:rPr>
+          <w:rFonts w:ascii="Arial Narrow" w:hAnsi="Arial Narrow"/>
+          <w:sz w:val="24"/>
+          <w:szCs w:val="24"/>
+        </w:rPr>
+        <w:t xml:space="preserve"> </w:t>
+      </w:r>
+      <w:r>
+        <w:rPr>
+          <w:rFonts w:ascii="Arial Narrow" w:hAnsi="Arial Narrow"/>
+          <w:sz w:val="24"/>
+          <w:szCs w:val="24"/>
+        </w:rPr>
+        <w:t xml:space="preserve">menjadi</w:t>
+      </w:r>
+      <w:r>
+        <w:rPr>
+          <w:rFonts w:ascii="Arial Narrow" w:hAnsi="Arial Narrow"/>
+          <w:sz w:val="24"/>
+          <w:szCs w:val="24"/>
+        </w:rPr>
+        <w:t xml:space="preserve"> </w:t>
+      </w:r>
+      <w:r>
+        <w:rPr>
+          <w:rFonts w:ascii="Arial Narrow" w:hAnsi="Arial Narrow"/>
+          <w:sz w:val="24"/>
+          <w:szCs w:val="24"/>
+        </w:rPr>
+        <w:t xml:space="preserve">tahu</w:t>
+      </w:r>
+      <w:r>
+        <w:rPr>
+          <w:rFonts w:ascii="Arial Narrow" w:hAnsi="Arial Narrow"/>
+          <w:sz w:val="24"/>
+          <w:szCs w:val="24"/>
+        </w:rPr>
+        <w:t xml:space="preserve"> </w:t>
+      </w:r>
+      <w:r>
+        <w:rPr>
+          <w:rFonts w:ascii="Arial Narrow" w:hAnsi="Arial Narrow"/>
+          <w:sz w:val="24"/>
+          <w:szCs w:val="24"/>
+        </w:rPr>
+        <w:t xml:space="preserve">dan</w:t>
+      </w:r>
+      <w:r>
+        <w:rPr>
+          <w:rFonts w:ascii="Arial Narrow" w:hAnsi="Arial Narrow"/>
+          <w:sz w:val="24"/>
+          <w:szCs w:val="24"/>
+        </w:rPr>
+        <w:t xml:space="preserve"> </w:t>
+      </w:r>
+      <w:r>
+        <w:rPr>
+          <w:rFonts w:ascii="Arial Narrow" w:hAnsi="Arial Narrow"/>
+          <w:sz w:val="24"/>
+          <w:szCs w:val="24"/>
+        </w:rPr>
+        <w:t xml:space="preserve">maklum</w:t>
+      </w:r>
+      <w:r>
+        <w:rPr>
+          <w:rFonts w:ascii="Arial Narrow" w:hAnsi="Arial Narrow"/>
+          <w:sz w:val="24"/>
+          <w:szCs w:val="24"/>
+        </w:rPr>
+        <w:t xml:space="preserve"> </w:t>
+      </w:r>
+      <w:r>
+        <w:rPr>
+          <w:rFonts w:ascii="Arial Narrow" w:hAnsi="Arial Narrow"/>
+          <w:sz w:val="24"/>
+          <w:szCs w:val="24"/>
+        </w:rPr>
+        <w:t xml:space="preserve">adanya</w:t>
+      </w:r>
+      <w:r>
+        <w:rPr>
+          <w:rFonts w:ascii="Arial Narrow" w:hAnsi="Arial Narrow"/>
+          <w:sz w:val="24"/>
+          <w:szCs w:val="24"/>
+        </w:rPr>
+        <w:t xml:space="preserve">.</w:t>
+      </w:r>
+      <w:r>
+        <w:rPr>
+          <w:rFonts w:ascii="Arial Narrow" w:hAnsi="Arial Narrow"/>
+          <w:sz w:val="24"/>
+          <w:szCs w:val="24"/>
+        </w:rPr>
+      </w:r>
+    </w:p>
+    <w:p>
+      <w:pPr>
+        <w:pBdr/>
+        <w:tabs>
+          <w:tab w:val="left" w:leader="none" w:pos="5688"/>
+        </w:tabs>
+        <w:spacing w:after="0"/>
+        <w:ind/>
+        <w:jc w:val="both"/>
+        <w:rPr>
+          <w:rFonts w:ascii="Arial Narrow" w:hAnsi="Arial Narrow"/>
+          <w:sz w:val="24"/>
+          <w:szCs w:val="24"/>
+        </w:rPr>
+      </w:pPr>
+      <w:r>
+        <w:rPr>
+          <w:rFonts w:ascii="Arial Narrow" w:hAnsi="Arial Narrow"/>
+          <w:sz w:val="24"/>
+          <w:szCs w:val="24"/>
+        </w:rPr>
+      </w:r>
+      <w:r>
+        <w:rPr>
+          <w:rFonts w:ascii="Arial Narrow" w:hAnsi="Arial Narrow"/>
+          <w:sz w:val="24"/>
+          <w:szCs w:val="24"/>
+        </w:rPr>
+      </w:r>
+    </w:p>
+    <w:tbl>
+      <w:tblPr>
+        <w:tblStyle w:val="765"/>
+        <w:tblW w:w="0" w:type="auto"/>
+        <w:tblBorders>
+          <w:top w:val="none" w:color="auto" w:sz="0" w:space="0"/>
+          <w:left w:val="none" w:color="auto" w:sz="0" w:space="0"/>
+          <w:bottom w:val="none" w:color="auto" w:sz="0" w:space="0"/>
+          <w:right w:val="none" w:color="auto" w:sz="0" w:space="0"/>
+          <w:insideH w:val="none" w:color="auto" w:sz="0" w:space="0"/>
+          <w:insideV w:val="none" w:color="auto" w:sz="0" w:space="0"/>
+        </w:tblBorders>
+        <w:tblLook w:val="04A0" w:firstRow="1" w:lastRow="0" w:firstColumn="1" w:lastColumn="0" w:noHBand="0" w:noVBand="1"/>
+      </w:tblPr>
+      <w:tblGrid>
+        <w:gridCol w:w="4621"/>
+        <w:gridCol w:w="4622"/>
+      </w:tblGrid>
+      <w:tr>
+        <w:trPr/>
+        <w:tc>
+          <w:tcPr>
+            <w:tcBorders/>
+            <w:tcW w:w="4621" w:type="dxa"/>
+          </w:tcPr>
+          <w:p>
+            <w:pPr>
+              <w:pBdr/>
+              <w:spacing/>
+              <w:ind/>
+              <w:jc w:val="center"/>
+              <w:rPr>
+                <w:rFonts w:ascii="Arial Narrow" w:hAnsi="Arial Narrow"/>
+                <w:sz w:val="24"/>
+                <w:szCs w:val="24"/>
+              </w:rPr>
+            </w:pPr>
+            <w:r>
+              <w:rPr>
+                <w:rFonts w:ascii="Arial Narrow" w:hAnsi="Arial Narrow"/>
+                <w:sz w:val="24"/>
+                <w:szCs w:val="24"/>
+              </w:rPr>
+            </w:r>
+            <w:r>
+              <w:rPr>
+                <w:rFonts w:ascii="Arial Narrow" w:hAnsi="Arial Narrow"/>
+                <w:sz w:val="24"/>
+                <w:szCs w:val="24"/>
+              </w:rPr>
+            </w:r>
+          </w:p>
+        </w:tc>
+        <w:tc>
+          <w:tcPr>
+            <w:tcBorders/>
+            <w:tcW w:w="4622" w:type="dxa"/>
+          </w:tcPr>
+          <w:p>
+            <w:pPr>
+              <w:pBdr/>
+              <w:spacing/>
+              <w:ind/>
+              <w:jc w:val="center"/>
+              <w:rPr>
+                <w:rFonts w:ascii="Arial Narrow" w:hAnsi="Arial Narrow"/>
+                <w:sz w:val="24"/>
+                <w:szCs w:val="24"/>
+              </w:rPr>
+            </w:pPr>
+            <w:r>
+              <w:rPr>
+                <w:rFonts w:ascii="Arial Narrow" w:hAnsi="Arial Narrow"/>
+                <w:sz w:val="24"/>
+                <w:szCs w:val="24"/>
+              </w:rPr>
+              <w:t xml:space="preserve">Cimanggu</w:t>
+            </w:r>
+            <w:r>
+              <w:rPr>
+                <w:rFonts w:ascii="Arial Narrow" w:hAnsi="Arial Narrow"/>
+                <w:sz w:val="24"/>
+                <w:szCs w:val="24"/>
+              </w:rPr>
+              <w:t xml:space="preserve"> I,                      </w:t>
+            </w:r>
+            <w:r>
+              <w:rPr>
+                <w:rFonts w:ascii="Arial Narrow" w:hAnsi="Arial Narrow"/>
+                <w:sz w:val="24"/>
+                <w:szCs w:val="24"/>
+              </w:rPr>
+              <w:t xml:space="preserve"> 2026</w:t>
+            </w:r>
+            <w:r>
+              <w:rPr>
+                <w:rFonts w:ascii="Arial Narrow" w:hAnsi="Arial Narrow"/>
+                <w:sz w:val="24"/>
+                <w:szCs w:val="24"/>
+              </w:rPr>
+            </w:r>
+          </w:p>
+        </w:tc>
+      </w:tr>
+      <w:tr>
+        <w:trPr/>
+        <w:tc>
+          <w:tcPr>
+            <w:tcBorders/>
+            <w:tcW w:w="4621" w:type="dxa"/>
+          </w:tcPr>
+          <w:p>
+            <w:pPr>
+              <w:pBdr/>
+              <w:spacing/>
+              <w:ind/>
+              <w:jc w:val="center"/>
+              <w:rPr>
+                <w:rFonts w:ascii="Arial Narrow" w:hAnsi="Arial Narrow"/>
+                <w:sz w:val="24"/>
+                <w:szCs w:val="24"/>
+              </w:rPr>
+            </w:pPr>
+            <w:r>
+              <w:rPr>
+                <w:rFonts w:ascii="Arial Narrow" w:hAnsi="Arial Narrow"/>
+                <w:sz w:val="24"/>
+                <w:szCs w:val="24"/>
+              </w:rPr>
+            </w:r>
+            <w:r>
+              <w:rPr>
+                <w:rFonts w:ascii="Arial Narrow" w:hAnsi="Arial Narrow"/>
+                <w:sz w:val="24"/>
+                <w:szCs w:val="24"/>
+              </w:rPr>
+            </w:r>
+          </w:p>
+        </w:tc>
+        <w:tc>
+          <w:tcPr>
+            <w:tcBorders/>
+            <w:tcW w:w="4622" w:type="dxa"/>
+          </w:tcPr>
+          <w:p>
+            <w:pPr>
+              <w:pBdr/>
+              <w:spacing/>
+              <w:ind/>
+              <w:jc w:val="center"/>
+              <w:rPr>
+                <w:rFonts w:ascii="Arial Narrow" w:hAnsi="Arial Narrow"/>
+                <w:sz w:val="24"/>
+                <w:szCs w:val="24"/>
+              </w:rPr>
+            </w:pPr>
+            <w:r>
+              <w:rPr>
+                <w:rFonts w:ascii="Arial Narrow" w:hAnsi="Arial Narrow"/>
+                <w:sz w:val="24"/>
+                <w:szCs w:val="24"/>
+              </w:rPr>
+              <w:t xml:space="preserve">Kepala</w:t>
+            </w:r>
+            <w:r>
+              <w:rPr>
+                <w:rFonts w:ascii="Arial Narrow" w:hAnsi="Arial Narrow"/>
+                <w:sz w:val="24"/>
+                <w:szCs w:val="24"/>
+              </w:rPr>
+            </w:r>
+          </w:p>
+        </w:tc>
+      </w:tr>
+      <w:tr>
+        <w:trPr/>
+        <w:tc>
+          <w:tcPr>
+            <w:tcBorders/>
+            <w:tcW w:w="4621" w:type="dxa"/>
+          </w:tcPr>
+          <w:p>
+            <w:pPr>
+              <w:pBdr/>
+              <w:spacing/>
+              <w:ind/>
+              <w:rPr>
+                <w:rFonts w:ascii="Arial Narrow" w:hAnsi="Arial Narrow"/>
+                <w:sz w:val="24"/>
+                <w:szCs w:val="24"/>
+              </w:rPr>
+            </w:pPr>
+            <w:r>
+              <w:rPr>
+                <w:rFonts w:ascii="Arial Narrow" w:hAnsi="Arial Narrow"/>
+                <w:sz w:val="24"/>
+                <w:szCs w:val="24"/>
+              </w:rPr>
+            </w:r>
+            <w:r>
+              <w:rPr>
+                <w:rFonts w:ascii="Arial Narrow" w:hAnsi="Arial Narrow"/>
+                <w:sz w:val="24"/>
+                <w:szCs w:val="24"/>
+              </w:rPr>
+            </w:r>
+          </w:p>
+        </w:tc>
+        <w:tc>
+          <w:tcPr>
+            <w:tcBorders/>
+            <w:tcW w:w="4622" w:type="dxa"/>
+          </w:tcPr>
+          <w:p>
+            <w:pPr>
+              <w:pBdr/>
+              <w:spacing/>
+              <w:ind/>
+              <w:jc w:val="center"/>
+              <w:rPr>
+                <w:rFonts w:ascii="Arial Narrow" w:hAnsi="Arial Narrow"/>
+                <w:sz w:val="24"/>
+                <w:szCs w:val="24"/>
+              </w:rPr>
+            </w:pPr>
+            <w:r>
+              <w:rPr>
+                <w:rFonts w:ascii="Arial Narrow" w:hAnsi="Arial Narrow"/>
+                <w:sz w:val="24"/>
+                <w:szCs w:val="24"/>
+              </w:rPr>
+              <w:t xml:space="preserve">an. </w:t>
+            </w:r>
+            <w:r>
+              <w:rPr>
+                <w:rFonts w:ascii="Arial Narrow" w:hAnsi="Arial Narrow"/>
+                <w:sz w:val="24"/>
+                <w:szCs w:val="24"/>
+              </w:rPr>
+              <w:t xml:space="preserve">Sekretaris</w:t>
+            </w:r>
+            <w:r>
+              <w:rPr>
+                <w:rFonts w:ascii="Arial Narrow" w:hAnsi="Arial Narrow"/>
+                <w:sz w:val="24"/>
+                <w:szCs w:val="24"/>
+              </w:rPr>
+            </w:r>
+          </w:p>
+          <w:p>
+            <w:pPr>
+              <w:pBdr/>
+              <w:spacing/>
+              <w:ind/>
+              <w:jc w:val="center"/>
+              <w:rPr>
+                <w:rFonts w:ascii="Arial Narrow" w:hAnsi="Arial Narrow"/>
+                <w:sz w:val="24"/>
+                <w:szCs w:val="24"/>
+              </w:rPr>
+            </w:pPr>
+            <w:r>
+              <w:rPr>
+                <w:rFonts w:ascii="Arial Narrow" w:hAnsi="Arial Narrow"/>
+                <w:sz w:val="24"/>
+                <w:szCs w:val="24"/>
+              </w:rPr>
+            </w:r>
+            <w:r>
+              <w:rPr>
+                <w:rFonts w:ascii="Arial Narrow" w:hAnsi="Arial Narrow"/>
+                <w:sz w:val="24"/>
+                <w:szCs w:val="24"/>
+              </w:rPr>
+            </w:r>
+          </w:p>
+          <w:p>
+            <w:pPr>
+              <w:pBdr/>
+              <w:spacing/>
+              <w:ind/>
+              <w:jc w:val="center"/>
+              <w:rPr>
+                <w:rFonts w:ascii="Arial Narrow" w:hAnsi="Arial Narrow"/>
+                <w:b/>
+                <w:sz w:val="24"/>
+                <w:szCs w:val="24"/>
+                <w:u w:val="single"/>
+              </w:rPr>
+            </w:pPr>
+            <w:r>
+              <mc:AlternateContent>
+                <mc:Choice Requires="wpg">
+                  <w:drawing>
+                    <wp:anchor xmlns:wp="http://schemas.openxmlformats.org/drawingml/2006/wordprocessingDrawing" xmlns:wp14="http://schemas.microsoft.com/office/word/2010/wordprocessingDrawing" distT="0" distB="0" distL="114300" distR="114300" simplePos="0" relativeHeight="251659264" behindDoc="0" locked="0" layoutInCell="1" allowOverlap="1">
+                      <wp:simplePos x="0" y="0"/>
+                      <wp:positionH relativeFrom="column">
+                        <wp:posOffset>1504950</wp:posOffset>
+                      </wp:positionH>
+                      <wp:positionV relativeFrom="paragraph">
+                        <wp:posOffset>134620</wp:posOffset>
+                      </wp:positionV>
+                      <wp:extent cx="628650" cy="381000"/>
+                      <wp:effectExtent l="0" t="0" r="0" b="0"/>
+                      <wp:wrapNone/>
+                      <wp:docPr id="2" name="_x0000_s16148"/>
+                      <wp:cNvGraphicFramePr/>
+                      <a:graphic xmlns:a="http://schemas.openxmlformats.org/drawingml/2006/main">
+                        <a:graphicData uri="http://schemas.microsoft.com/office/word/2010/wordprocessingShape">
+                          <wps:wsp>
+                            <wps:cNvPr id="0" name=""/>
+                            <wps:cNvSpPr txBox="1"/>
+                            <wps:spPr bwMode="auto">
+                              <a:xfrm>
+                                <a:off x="1504950" y="134620"/>
+                                <a:ext cx="628650" cy="381000"/>
+                              </a:xfrm>
+                              <a:prstGeom prst="rect">
+                                <a:avLst/>
+                              </a:prstGeom>
+                              <a:solidFill>
+                                <a:srgbClr val="FFFFFF"/>
+                              </a:solidFill>
+                              <a:ln>
+                                <a:noFill/>
+                              </a:ln>
+                            </wps:spPr>
+                            <wps:txbx>
+                              <w:txbxContent>
+                                <w:p>
+                                  <w:pPr>
+                                    <w:pBdr/>
+                                    <w:spacing w:after="0"/>
+                                    <w:ind/>
+                                    <w:jc w:val="center"/>
+                                    <w:rPr>
+                                      <w:i/>
+                                      <w:color w:val="ff0000"/>
+                                      <w:sz w:val="18"/>
+                                      <w:szCs w:val="18"/>
+                                    </w:rPr>
+                                  </w:pPr>
+                                  <w:r>
+                                    <w:rPr>
+                                      <w:i/>
+                                      <w:color w:val="ff0000"/>
+                                      <w:sz w:val="18"/>
+                                      <w:szCs w:val="18"/>
+                                    </w:rPr>
+                                    <w:t xml:space="preserve">Materai</w:t>
+                                  </w:r>
+                                  <w:r>
+                                    <w:rPr>
+                                      <w:i/>
+                                      <w:color w:val="ff0000"/>
+                                      <w:sz w:val="18"/>
+                                      <w:szCs w:val="18"/>
+                                    </w:rPr>
+                                  </w:r>
+                                </w:p>
+                                <w:p>
+                                  <w:pPr>
+                                    <w:pBdr/>
+                                    <w:spacing w:after="0"/>
+                                    <w:ind/>
+                                    <w:jc w:val="center"/>
+                                    <w:rPr>
+                                      <w:i/>
+                                      <w:color w:val="ff0000"/>
+                                      <w:sz w:val="18"/>
+                                      <w:szCs w:val="18"/>
+                                    </w:rPr>
+                                  </w:pPr>
+                                  <w:r>
+                                    <w:rPr>
+                                      <w:i/>
+                                      <w:color w:val="ff0000"/>
+                                      <w:sz w:val="18"/>
+                                      <w:szCs w:val="18"/>
+                                    </w:rPr>
+                                    <w:t xml:space="preserve">10</w:t>
+                                  </w:r>
+                                  <w:r>
+                                    <w:rPr>
+                                      <w:i/>
+                                      <w:color w:val="ff0000"/>
+                                      <w:sz w:val="18"/>
+                                      <w:szCs w:val="18"/>
+                                    </w:rPr>
+                                    <w:t xml:space="preserve">.</w:t>
+                                  </w:r>
+                                  <w:r>
+                                    <w:rPr>
+                                      <w:i/>
+                                      <w:color w:val="ff0000"/>
+                                      <w:sz w:val="18"/>
+                                      <w:szCs w:val="18"/>
+                                    </w:rPr>
+                                    <w:t xml:space="preserve">000</w:t>
+                                  </w:r>
+                                  <w:r>
+                                    <w:rPr>
+                                      <w:i/>
+                                      <w:color w:val="ff0000"/>
+                                      <w:sz w:val="18"/>
+                                      <w:szCs w:val="18"/>
+                                    </w:rPr>
+                                  </w:r>
+                                </w:p>
+                                <w:p>
+                                  <w:pPr>
+                                    <w:pBdr/>
+                                    <w:spacing w:after="0"/>
+                                    <w:ind/>
+                                    <w:jc w:val="center"/>
+                                    <w:rPr>
+                                      <w:sz w:val="18"/>
+                                      <w:szCs w:val="18"/>
+                                    </w:rPr>
+                                  </w:pPr>
+                                  <w:r>
+                                    <w:rPr>
+                                      <w:sz w:val="18"/>
+                                      <w:szCs w:val="18"/>
+                                    </w:rPr>
+                                    <w:t xml:space="preserve">6000</w:t>
+                                  </w:r>
+                                  <w:r>
+                                    <w:rPr>
+                                      <w:sz w:val="18"/>
+                                      <w:szCs w:val="18"/>
+                                    </w:rPr>
+                                  </w:r>
+                                </w:p>
+                              </w:txbxContent>
+                            </wps:txbx>
+                            <wps:bodyPr wrap="square" lIns="91440" tIns="45720" rIns="91440" bIns="45720" upright="1"/>
+                          </wps:wsp>
+                        </a:graphicData>
+                      </a:graphic>
+                    </wp:anchor>
+                  </w:drawing>
+                </mc:Choice>
+                <mc:Fallback>
+                  <w:pict>
+                    <v:shape id="shape 1" o:spid="_x0000_s1" o:spt="202" type="#_x0000_t202" style="position:absolute;z-index:251659264;o:allowoverlap:true;o:allowincell:true;mso-position-horizontal-relative:text;margin-left:118.50pt;mso-position-horizontal:absolute;mso-position-vertical-relative:text;margin-top:10.60pt;mso-position-vertical:absolute;width:49.50pt;height:30.00pt;mso-wrap-distance-left:9.00pt;mso-wrap-distance-top:0.00pt;mso-wrap-distance-right:9.00pt;mso-wrap-distance-bottom:0.00pt;visibility:visible;" fillcolor="#FFFFFF" stroked="f">
+                      <v:textbox inset="0,0,0,0">
+                        <w:txbxContent>
+                          <w:p>
+                            <w:pPr>
+                              <w:pBdr/>
+                              <w:spacing w:after="0"/>
+                              <w:ind/>
+                              <w:jc w:val="center"/>
+                              <w:rPr>
+                                <w:i/>
+                                <w:color w:val="ff0000"/>
+                                <w:sz w:val="18"/>
+                                <w:szCs w:val="18"/>
+                              </w:rPr>
+                            </w:pPr>
+                            <w:r>
+                              <w:rPr>
+                                <w:i/>
+                                <w:color w:val="ff0000"/>
+                                <w:sz w:val="18"/>
+                                <w:szCs w:val="18"/>
+                              </w:rPr>
+                              <w:t xml:space="preserve">Materai</w:t>
+                            </w:r>
+                            <w:r>
+                              <w:rPr>
+                                <w:i/>
+                                <w:color w:val="ff0000"/>
+                                <w:sz w:val="18"/>
+                                <w:szCs w:val="18"/>
+                              </w:rPr>
+                            </w:r>
+                          </w:p>
+                          <w:p>
+                            <w:pPr>
+                              <w:pBdr/>
+                              <w:spacing w:after="0"/>
+                              <w:ind/>
+                              <w:jc w:val="center"/>
+                              <w:rPr>
+                                <w:i/>
+                                <w:color w:val="ff0000"/>
+                                <w:sz w:val="18"/>
+                                <w:szCs w:val="18"/>
+                              </w:rPr>
+                            </w:pPr>
+                            <w:r>
+                              <w:rPr>
+                                <w:i/>
+                                <w:color w:val="ff0000"/>
+                                <w:sz w:val="18"/>
+                                <w:szCs w:val="18"/>
+                              </w:rPr>
+                              <w:t xml:space="preserve">10</w:t>
+                            </w:r>
+                            <w:r>
+                              <w:rPr>
+                                <w:i/>
+                                <w:color w:val="ff0000"/>
+                                <w:sz w:val="18"/>
+                                <w:szCs w:val="18"/>
+                              </w:rPr>
+                              <w:t xml:space="preserve">.</w:t>
+                            </w:r>
+                            <w:r>
+                              <w:rPr>
+                                <w:i/>
+                                <w:color w:val="ff0000"/>
+                                <w:sz w:val="18"/>
+                                <w:szCs w:val="18"/>
+                              </w:rPr>
+                              <w:t xml:space="preserve">000</w:t>
+                            </w:r>
+                            <w:r>
+                              <w:rPr>
+                                <w:i/>
+                                <w:color w:val="ff0000"/>
+                                <w:sz w:val="18"/>
+                                <w:szCs w:val="18"/>
+                              </w:rPr>
+                            </w:r>
+                          </w:p>
+                          <w:p>
+                            <w:pPr>
+                              <w:pBdr/>
+                              <w:spacing w:after="0"/>
+                              <w:ind/>
+                              <w:jc w:val="center"/>
+                              <w:rPr>
+                                <w:sz w:val="18"/>
+                                <w:szCs w:val="18"/>
+                              </w:rPr>
+                            </w:pPr>
+                            <w:r>
+                              <w:rPr>
+                                <w:sz w:val="18"/>
+                                <w:szCs w:val="18"/>
+                              </w:rPr>
+                              <w:t xml:space="preserve">6000</w:t>
+                            </w:r>
+                            <w:r>
+                              <w:rPr>
+                                <w:sz w:val="18"/>
+                                <w:szCs w:val="18"/>
+                              </w:rPr>
+                            </w:r>
+                          </w:p>
+                        </w:txbxContent>
+                      </v:textbox>
+                    </v:shape>
+                  </w:pict>
+                </mc:Fallback>
+              </mc:AlternateContent>
+            </w:r>
+            <w:r>
+              <w:rPr>
+                <w:rFonts w:ascii="Arial Narrow" w:hAnsi="Arial Narrow"/>
+                <w:b/>
+                <w:sz w:val="24"/>
+                <w:szCs w:val="24"/>
+                <w:u w:val="single"/>
+              </w:rPr>
+            </w:r>
+          </w:p>
+          <w:p>
+            <w:pPr>
+              <w:pBdr/>
+              <w:spacing/>
+              <w:ind/>
+              <w:jc w:val="center"/>
+              <w:rPr>
+                <w:rFonts w:ascii="Arial Narrow" w:hAnsi="Arial Narrow"/>
+                <w:b/>
+                <w:sz w:val="24"/>
+                <w:szCs w:val="24"/>
+                <w:u w:val="single"/>
+              </w:rPr>
+            </w:pPr>
+            <w:r>
+              <w:rPr>
+                <w:rFonts w:ascii="Arial Narrow" w:hAnsi="Arial Narrow"/>
+                <w:b/>
+                <w:sz w:val="24"/>
+                <w:szCs w:val="24"/>
+                <w:u w:val="single"/>
+              </w:rPr>
+            </w:r>
+            <w:r>
+              <w:rPr>
+                <w:rFonts w:ascii="Arial Narrow" w:hAnsi="Arial Narrow"/>
+                <w:b/>
+                <w:sz w:val="24"/>
+                <w:szCs w:val="24"/>
+                <w:u w:val="single"/>
+              </w:rPr>
+            </w:r>
+          </w:p>
+          <w:p>
+            <w:pPr>
+              <w:pBdr/>
+              <w:spacing/>
+              <w:ind/>
+              <w:jc w:val="center"/>
+              <w:rPr>
+                <w:rFonts w:ascii="Arial Narrow" w:hAnsi="Arial Narrow"/>
+                <w:b/>
+                <w:sz w:val="24"/>
+                <w:szCs w:val="24"/>
+                <w:u w:val="single"/>
+              </w:rPr>
+            </w:pPr>
+            <w:r>
+              <w:rPr>
+                <w:rFonts w:ascii="Arial Narrow" w:hAnsi="Arial Narrow"/>
+                <w:b/>
+                <w:sz w:val="24"/>
+                <w:szCs w:val="24"/>
+                <w:u w:val="single"/>
+              </w:rPr>
+            </w:r>
+            <w:r>
+              <w:rPr>
+                <w:rFonts w:ascii="Arial Narrow" w:hAnsi="Arial Narrow"/>
+                <w:b/>
+                <w:sz w:val="24"/>
+                <w:szCs w:val="24"/>
+                <w:u w:val="single"/>
+              </w:rPr>
+            </w:r>
+          </w:p>
+          <w:p>
+            <w:pPr>
+              <w:pBdr/>
+              <w:spacing/>
+              <w:ind/>
+              <w:jc w:val="center"/>
+              <w:rPr>
+                <w:rFonts w:ascii="Arial Narrow" w:hAnsi="Arial Narrow"/>
+                <w:b/>
+                <w:sz w:val="24"/>
+                <w:szCs w:val="24"/>
+                <w:u w:val="single"/>
+              </w:rPr>
+            </w:pPr>
+            <w:r>
+              <w:rPr>
+                <w:rFonts w:ascii="Arial Narrow" w:hAnsi="Arial Narrow"/>
+                <w:b/>
+                <w:sz w:val="24"/>
+                <w:szCs w:val="24"/>
+                <w:u w:val="single"/>
+              </w:rPr>
+            </w:r>
+            <w:r>
+              <w:rPr>
+                <w:rFonts w:ascii="Arial Narrow" w:hAnsi="Arial Narrow"/>
+                <w:b/>
+                <w:sz w:val="24"/>
+                <w:szCs w:val="24"/>
+                <w:u w:val="single"/>
+              </w:rPr>
+            </w:r>
+          </w:p>
+          <w:p>
+            <w:pPr>
+              <w:pBdr/>
+              <w:spacing/>
+              <w:ind/>
+              <w:jc w:val="center"/>
+              <w:rPr>
+                <w:rFonts w:ascii="Arial Narrow" w:hAnsi="Arial Narrow"/>
+                <w:b/>
+                <w:sz w:val="24"/>
+                <w:szCs w:val="24"/>
+              </w:rPr>
+            </w:pPr>
+            <w:r>
+              <w:rPr>
+                <w:rFonts w:ascii="Arial Narrow" w:hAnsi="Arial Narrow"/>
+                <w:b/>
+                <w:sz w:val="24"/>
+                <w:szCs w:val="24"/>
+              </w:rPr>
+            </w:r>
+            <w:r>
+              <w:rPr>
+                <w:rFonts w:ascii="Arial Narrow" w:hAnsi="Arial Narrow"/>
+                <w:b/>
+                <w:sz w:val="24"/>
+                <w:szCs w:val="24"/>
+              </w:rPr>
+            </w:r>
+          </w:p>
+          <w:p>
+            <w:pPr>
+              <w:pBdr/>
+              <w:spacing/>
+              <w:ind/>
+              <w:jc w:val="center"/>
+              <w:rPr>
+                <w:rFonts w:ascii="Arial Narrow" w:hAnsi="Arial Narrow"/>
+                <w:b/>
+                <w:sz w:val="24"/>
+                <w:szCs w:val="24"/>
+              </w:rPr>
+            </w:pPr>
+            <w:r>
+              <w:rPr>
+                <w:rFonts w:ascii="Arial Narrow" w:hAnsi="Arial Narrow"/>
+                <w:b/>
+                <w:sz w:val="24"/>
+                <w:szCs w:val="24"/>
+              </w:rPr>
+              <w:t xml:space="preserve">FAJAR TRI APRIANA</w:t>
+            </w:r>
+            <w:r>
+              <w:rPr>
+                <w:rFonts w:ascii="Arial Narrow" w:hAnsi="Arial Narrow"/>
+                <w:b/>
+                <w:sz w:val="24"/>
+                <w:szCs w:val="24"/>
+              </w:rPr>
+            </w:r>
+          </w:p>
+        </w:tc>
+      </w:tr>
+    </w:tbl>
+    <w:p>
+      <w:pPr>
+        <w:pBdr/>
+        <w:spacing/>
+        <w:ind/>
+        <w:rPr/>
+      </w:pPr>
+      <w:r/>
+      <w:r/>
+    </w:p>
+    <w:sectPr>
+      <w:headerReference w:type="default" r:id="rId9"/>
+      <w:footnotePr/>
+      <w:endnotePr/>
+      <w:type w:val="nextPage"/>
+      <w:pgSz w:h="16839" w:orient="portrait" w:w="11907"/>
+      <w:pgMar w:top="851" w:right="1440" w:bottom="1440" w:left="1440" w:header="720" w:footer="720" w:gutter="0"/>
+      <w:cols w:num="1" w:sep="0" w:space="720" w:equalWidth="1"/>
+    </w:sectPr>
+  </w:body>
+</w:document>
 </file>
 
 <file path=word/endnotes.xml><?xml version="1.0" encoding="utf-8"?>

</xml_diff>